<commit_message>
docs: update lab 3 report
</commit_message>
<xml_diff>
--- a/report/Отчет_ЛР3.docx
+++ b/report/Отчет_ЛР3.docx
@@ -297,7 +297,7 @@
       <w:r>
         <w:fldChar w:fldCharType="separate"/>
       </w:r>
-      <w:hyperlink w:anchor="_Toc242378584" w:history="1">
+      <w:hyperlink w:anchor="_Toc242385949" w:history="1">
         <w:r>
           <w:rPr>
             <w:rStyle w:val="aff8"/>
@@ -324,7 +324,7 @@
             <w:noProof/>
             <w:webHidden/>
           </w:rPr>
-          <w:instrText xml:space="preserve"> PAGEREF _Toc242378584 \h </w:instrText>
+          <w:instrText xml:space="preserve"> PAGEREF _Toc242385949 \h </w:instrText>
         </w:r>
         <w:r>
           <w:rPr>
@@ -370,7 +370,7 @@
           <w14:ligatures w14:val="standardContextual"/>
         </w:rPr>
       </w:pPr>
-      <w:hyperlink w:anchor="_Toc242378585" w:history="1">
+      <w:hyperlink w:anchor="_Toc242385950" w:history="1">
         <w:r>
           <w:rPr>
             <w:rStyle w:val="aff8"/>
@@ -397,7 +397,7 @@
             <w:noProof/>
             <w:webHidden/>
           </w:rPr>
-          <w:instrText xml:space="preserve"> PAGEREF _Toc242378585 \h </w:instrText>
+          <w:instrText xml:space="preserve"> PAGEREF _Toc242385950 \h </w:instrText>
         </w:r>
         <w:r>
           <w:rPr>
@@ -443,7 +443,7 @@
           <w14:ligatures w14:val="standardContextual"/>
         </w:rPr>
       </w:pPr>
-      <w:hyperlink w:anchor="_Toc242378586" w:history="1">
+      <w:hyperlink w:anchor="_Toc242385951" w:history="1">
         <w:r>
           <w:rPr>
             <w:rStyle w:val="aff8"/>
@@ -470,7 +470,7 @@
             <w:noProof/>
             <w:webHidden/>
           </w:rPr>
-          <w:instrText xml:space="preserve"> PAGEREF _Toc242378586 \h </w:instrText>
+          <w:instrText xml:space="preserve"> PAGEREF _Toc242385951 \h </w:instrText>
         </w:r>
         <w:r>
           <w:rPr>
@@ -516,7 +516,7 @@
           <w14:ligatures w14:val="standardContextual"/>
         </w:rPr>
       </w:pPr>
-      <w:hyperlink w:anchor="_Toc242378587" w:history="1">
+      <w:hyperlink w:anchor="_Toc242385952" w:history="1">
         <w:r>
           <w:rPr>
             <w:rStyle w:val="aff8"/>
@@ -543,7 +543,7 @@
             <w:noProof/>
             <w:webHidden/>
           </w:rPr>
-          <w:instrText xml:space="preserve"> PAGEREF _Toc242378587 \h </w:instrText>
+          <w:instrText xml:space="preserve"> PAGEREF _Toc242385952 \h </w:instrText>
         </w:r>
         <w:r>
           <w:rPr>
@@ -589,7 +589,7 @@
           <w14:ligatures w14:val="standardContextual"/>
         </w:rPr>
       </w:pPr>
-      <w:hyperlink w:anchor="_Toc242378588" w:history="1">
+      <w:hyperlink w:anchor="_Toc242385953" w:history="1">
         <w:r>
           <w:rPr>
             <w:rStyle w:val="aff8"/>
@@ -616,7 +616,7 @@
             <w:noProof/>
             <w:webHidden/>
           </w:rPr>
-          <w:instrText xml:space="preserve"> PAGEREF _Toc242378588 \h </w:instrText>
+          <w:instrText xml:space="preserve"> PAGEREF _Toc242385953 \h </w:instrText>
         </w:r>
         <w:r>
           <w:rPr>
@@ -662,7 +662,7 @@
           <w14:ligatures w14:val="standardContextual"/>
         </w:rPr>
       </w:pPr>
-      <w:hyperlink w:anchor="_Toc242378589" w:history="1">
+      <w:hyperlink w:anchor="_Toc242385954" w:history="1">
         <w:r>
           <w:rPr>
             <w:rStyle w:val="aff8"/>
@@ -689,7 +689,7 @@
             <w:noProof/>
             <w:webHidden/>
           </w:rPr>
-          <w:instrText xml:space="preserve"> PAGEREF _Toc242378589 \h </w:instrText>
+          <w:instrText xml:space="preserve"> PAGEREF _Toc242385954 \h </w:instrText>
         </w:r>
         <w:r>
           <w:rPr>
@@ -735,7 +735,7 @@
           <w14:ligatures w14:val="standardContextual"/>
         </w:rPr>
       </w:pPr>
-      <w:hyperlink w:anchor="_Toc242378590" w:history="1">
+      <w:hyperlink w:anchor="_Toc242385955" w:history="1">
         <w:r>
           <w:rPr>
             <w:rStyle w:val="aff8"/>
@@ -762,7 +762,7 @@
             <w:noProof/>
             <w:webHidden/>
           </w:rPr>
-          <w:instrText xml:space="preserve"> PAGEREF _Toc242378590 \h </w:instrText>
+          <w:instrText xml:space="preserve"> PAGEREF _Toc242385955 \h </w:instrText>
         </w:r>
         <w:r>
           <w:rPr>
@@ -808,7 +808,7 @@
           <w14:ligatures w14:val="standardContextual"/>
         </w:rPr>
       </w:pPr>
-      <w:hyperlink w:anchor="_Toc242378591" w:history="1">
+      <w:hyperlink w:anchor="_Toc242385956" w:history="1">
         <w:r>
           <w:rPr>
             <w:rStyle w:val="aff8"/>
@@ -835,7 +835,7 @@
             <w:noProof/>
             <w:webHidden/>
           </w:rPr>
-          <w:instrText xml:space="preserve"> PAGEREF _Toc242378591 \h </w:instrText>
+          <w:instrText xml:space="preserve"> PAGEREF _Toc242385956 \h </w:instrText>
         </w:r>
         <w:r>
           <w:rPr>
@@ -881,7 +881,7 @@
           <w14:ligatures w14:val="standardContextual"/>
         </w:rPr>
       </w:pPr>
-      <w:hyperlink w:anchor="_Toc242378592" w:history="1">
+      <w:hyperlink w:anchor="_Toc242385957" w:history="1">
         <w:r>
           <w:rPr>
             <w:rStyle w:val="aff8"/>
@@ -908,7 +908,7 @@
             <w:noProof/>
             <w:webHidden/>
           </w:rPr>
-          <w:instrText xml:space="preserve"> PAGEREF _Toc242378592 \h </w:instrText>
+          <w:instrText xml:space="preserve"> PAGEREF _Toc242385957 \h </w:instrText>
         </w:r>
         <w:r>
           <w:rPr>
@@ -954,7 +954,7 @@
           <w14:ligatures w14:val="standardContextual"/>
         </w:rPr>
       </w:pPr>
-      <w:hyperlink w:anchor="_Toc242378593" w:history="1">
+      <w:hyperlink w:anchor="_Toc242385958" w:history="1">
         <w:r>
           <w:rPr>
             <w:rStyle w:val="aff8"/>
@@ -989,7 +989,7 @@
             <w:noProof/>
             <w:webHidden/>
           </w:rPr>
-          <w:instrText xml:space="preserve"> PAGEREF _Toc242378593 \h </w:instrText>
+          <w:instrText xml:space="preserve"> PAGEREF _Toc242385958 \h </w:instrText>
         </w:r>
         <w:r>
           <w:rPr>
@@ -1035,7 +1035,7 @@
           <w14:ligatures w14:val="standardContextual"/>
         </w:rPr>
       </w:pPr>
-      <w:hyperlink w:anchor="_Toc242378594" w:history="1">
+      <w:hyperlink w:anchor="_Toc242385959" w:history="1">
         <w:r>
           <w:rPr>
             <w:rStyle w:val="aff8"/>
@@ -1062,7 +1062,7 @@
             <w:noProof/>
             <w:webHidden/>
           </w:rPr>
-          <w:instrText xml:space="preserve"> PAGEREF _Toc242378594 \h </w:instrText>
+          <w:instrText xml:space="preserve"> PAGEREF _Toc242385959 \h </w:instrText>
         </w:r>
         <w:r>
           <w:rPr>
@@ -1108,7 +1108,7 @@
           <w14:ligatures w14:val="standardContextual"/>
         </w:rPr>
       </w:pPr>
-      <w:hyperlink w:anchor="_Toc242378595" w:history="1">
+      <w:hyperlink w:anchor="_Toc242385960" w:history="1">
         <w:r>
           <w:rPr>
             <w:rStyle w:val="aff8"/>
@@ -1135,7 +1135,7 @@
             <w:noProof/>
             <w:webHidden/>
           </w:rPr>
-          <w:instrText xml:space="preserve"> PAGEREF _Toc242378595 \h </w:instrText>
+          <w:instrText xml:space="preserve"> PAGEREF _Toc242385960 \h </w:instrText>
         </w:r>
         <w:r>
           <w:rPr>
@@ -1181,7 +1181,7 @@
           <w14:ligatures w14:val="standardContextual"/>
         </w:rPr>
       </w:pPr>
-      <w:hyperlink w:anchor="_Toc242378596" w:history="1">
+      <w:hyperlink w:anchor="_Toc242385961" w:history="1">
         <w:r>
           <w:rPr>
             <w:rStyle w:val="aff8"/>
@@ -1208,7 +1208,7 @@
             <w:noProof/>
             <w:webHidden/>
           </w:rPr>
-          <w:instrText xml:space="preserve"> PAGEREF _Toc242378596 \h </w:instrText>
+          <w:instrText xml:space="preserve"> PAGEREF _Toc242385961 \h </w:instrText>
         </w:r>
         <w:r>
           <w:rPr>
@@ -1254,7 +1254,7 @@
           <w14:ligatures w14:val="standardContextual"/>
         </w:rPr>
       </w:pPr>
-      <w:hyperlink w:anchor="_Toc242378597" w:history="1">
+      <w:hyperlink w:anchor="_Toc242385962" w:history="1">
         <w:r>
           <w:rPr>
             <w:rStyle w:val="aff8"/>
@@ -1281,7 +1281,7 @@
             <w:noProof/>
             <w:webHidden/>
           </w:rPr>
-          <w:instrText xml:space="preserve"> PAGEREF _Toc242378597 \h </w:instrText>
+          <w:instrText xml:space="preserve"> PAGEREF _Toc242385962 \h </w:instrText>
         </w:r>
         <w:r>
           <w:rPr>
@@ -1327,7 +1327,7 @@
           <w14:ligatures w14:val="standardContextual"/>
         </w:rPr>
       </w:pPr>
-      <w:hyperlink w:anchor="_Toc242378598" w:history="1">
+      <w:hyperlink w:anchor="_Toc242385963" w:history="1">
         <w:r>
           <w:rPr>
             <w:rStyle w:val="aff8"/>
@@ -1354,7 +1354,7 @@
             <w:noProof/>
             <w:webHidden/>
           </w:rPr>
-          <w:instrText xml:space="preserve"> PAGEREF _Toc242378598 \h </w:instrText>
+          <w:instrText xml:space="preserve"> PAGEREF _Toc242385963 \h </w:instrText>
         </w:r>
         <w:r>
           <w:rPr>
@@ -1400,7 +1400,7 @@
           <w14:ligatures w14:val="standardContextual"/>
         </w:rPr>
       </w:pPr>
-      <w:hyperlink w:anchor="_Toc242378599" w:history="1">
+      <w:hyperlink w:anchor="_Toc242385964" w:history="1">
         <w:r>
           <w:rPr>
             <w:rStyle w:val="aff8"/>
@@ -1442,7 +1442,7 @@
             <w:noProof/>
             <w:webHidden/>
           </w:rPr>
-          <w:instrText xml:space="preserve"> PAGEREF _Toc242378599 \h </w:instrText>
+          <w:instrText xml:space="preserve"> PAGEREF _Toc242385964 \h </w:instrText>
         </w:r>
         <w:r>
           <w:rPr>
@@ -1488,7 +1488,7 @@
           <w14:ligatures w14:val="standardContextual"/>
         </w:rPr>
       </w:pPr>
-      <w:hyperlink w:anchor="_Toc242378600" w:history="1">
+      <w:hyperlink w:anchor="_Toc242385965" w:history="1">
         <w:r>
           <w:rPr>
             <w:rStyle w:val="aff8"/>
@@ -1515,7 +1515,7 @@
             <w:noProof/>
             <w:webHidden/>
           </w:rPr>
-          <w:instrText xml:space="preserve"> PAGEREF _Toc242378600 \h </w:instrText>
+          <w:instrText xml:space="preserve"> PAGEREF _Toc242385965 \h </w:instrText>
         </w:r>
         <w:r>
           <w:rPr>
@@ -1561,7 +1561,7 @@
           <w14:ligatures w14:val="standardContextual"/>
         </w:rPr>
       </w:pPr>
-      <w:hyperlink w:anchor="_Toc242378601" w:history="1">
+      <w:hyperlink w:anchor="_Toc242385966" w:history="1">
         <w:r>
           <w:rPr>
             <w:rStyle w:val="aff8"/>
@@ -1618,7 +1618,7 @@
             <w:noProof/>
             <w:webHidden/>
           </w:rPr>
-          <w:instrText xml:space="preserve"> PAGEREF _Toc242378601 \h </w:instrText>
+          <w:instrText xml:space="preserve"> PAGEREF _Toc242385966 \h </w:instrText>
         </w:r>
         <w:r>
           <w:rPr>
@@ -1664,7 +1664,7 @@
           <w14:ligatures w14:val="standardContextual"/>
         </w:rPr>
       </w:pPr>
-      <w:hyperlink w:anchor="_Toc242378602" w:history="1">
+      <w:hyperlink w:anchor="_Toc242385967" w:history="1">
         <w:r>
           <w:rPr>
             <w:rStyle w:val="aff8"/>
@@ -1691,7 +1691,7 @@
             <w:noProof/>
             <w:webHidden/>
           </w:rPr>
-          <w:instrText xml:space="preserve"> PAGEREF _Toc242378602 \h </w:instrText>
+          <w:instrText xml:space="preserve"> PAGEREF _Toc242385967 \h </w:instrText>
         </w:r>
         <w:r>
           <w:rPr>
@@ -1737,7 +1737,7 @@
           <w14:ligatures w14:val="standardContextual"/>
         </w:rPr>
       </w:pPr>
-      <w:hyperlink w:anchor="_Toc242378603" w:history="1">
+      <w:hyperlink w:anchor="_Toc242385968" w:history="1">
         <w:r>
           <w:rPr>
             <w:rStyle w:val="aff8"/>
@@ -1764,7 +1764,7 @@
             <w:noProof/>
             <w:webHidden/>
           </w:rPr>
-          <w:instrText xml:space="preserve"> PAGEREF _Toc242378603 \h </w:instrText>
+          <w:instrText xml:space="preserve"> PAGEREF _Toc242385968 \h </w:instrText>
         </w:r>
         <w:r>
           <w:rPr>
@@ -1810,7 +1810,7 @@
           <w14:ligatures w14:val="standardContextual"/>
         </w:rPr>
       </w:pPr>
-      <w:hyperlink w:anchor="_Toc242378604" w:history="1">
+      <w:hyperlink w:anchor="_Toc242385969" w:history="1">
         <w:r>
           <w:rPr>
             <w:rStyle w:val="aff8"/>
@@ -1845,7 +1845,7 @@
             <w:noProof/>
             <w:webHidden/>
           </w:rPr>
-          <w:instrText xml:space="preserve"> PAGEREF _Toc242378604 \h </w:instrText>
+          <w:instrText xml:space="preserve"> PAGEREF _Toc242385969 \h </w:instrText>
         </w:r>
         <w:r>
           <w:rPr>
@@ -1891,7 +1891,7 @@
           <w14:ligatures w14:val="standardContextual"/>
         </w:rPr>
       </w:pPr>
-      <w:hyperlink w:anchor="_Toc242378605" w:history="1">
+      <w:hyperlink w:anchor="_Toc242385970" w:history="1">
         <w:r>
           <w:rPr>
             <w:rStyle w:val="aff8"/>
@@ -1918,7 +1918,7 @@
             <w:noProof/>
             <w:webHidden/>
           </w:rPr>
-          <w:instrText xml:space="preserve"> PAGEREF _Toc242378605 \h </w:instrText>
+          <w:instrText xml:space="preserve"> PAGEREF _Toc242385970 \h </w:instrText>
         </w:r>
         <w:r>
           <w:rPr>
@@ -1964,7 +1964,7 @@
           <w14:ligatures w14:val="standardContextual"/>
         </w:rPr>
       </w:pPr>
-      <w:hyperlink w:anchor="_Toc242378606" w:history="1">
+      <w:hyperlink w:anchor="_Toc242385971" w:history="1">
         <w:r>
           <w:rPr>
             <w:rStyle w:val="aff8"/>
@@ -1991,7 +1991,7 @@
             <w:noProof/>
             <w:webHidden/>
           </w:rPr>
-          <w:instrText xml:space="preserve"> PAGEREF _Toc242378606 \h </w:instrText>
+          <w:instrText xml:space="preserve"> PAGEREF _Toc242385971 \h </w:instrText>
         </w:r>
         <w:r>
           <w:rPr>
@@ -2037,7 +2037,7 @@
           <w14:ligatures w14:val="standardContextual"/>
         </w:rPr>
       </w:pPr>
-      <w:hyperlink w:anchor="_Toc242378607" w:history="1">
+      <w:hyperlink w:anchor="_Toc242385972" w:history="1">
         <w:r>
           <w:rPr>
             <w:rStyle w:val="aff8"/>
@@ -2064,7 +2064,7 @@
             <w:noProof/>
             <w:webHidden/>
           </w:rPr>
-          <w:instrText xml:space="preserve"> PAGEREF _Toc242378607 \h </w:instrText>
+          <w:instrText xml:space="preserve"> PAGEREF _Toc242385972 \h </w:instrText>
         </w:r>
         <w:r>
           <w:rPr>
@@ -2110,7 +2110,7 @@
           <w14:ligatures w14:val="standardContextual"/>
         </w:rPr>
       </w:pPr>
-      <w:hyperlink w:anchor="_Toc242378608" w:history="1">
+      <w:hyperlink w:anchor="_Toc242385973" w:history="1">
         <w:r>
           <w:rPr>
             <w:rStyle w:val="aff8"/>
@@ -2137,7 +2137,7 @@
             <w:noProof/>
             <w:webHidden/>
           </w:rPr>
-          <w:instrText xml:space="preserve"> PAGEREF _Toc242378608 \h </w:instrText>
+          <w:instrText xml:space="preserve"> PAGEREF _Toc242385973 \h </w:instrText>
         </w:r>
         <w:r>
           <w:rPr>
@@ -2183,7 +2183,7 @@
         <w:pStyle w:val="1"/>
         <w:ind w:firstLine="709"/>
       </w:pPr>
-      <w:bookmarkStart w:id="0" w:name="_Toc242378584"/>
+      <w:bookmarkStart w:id="0" w:name="_Toc242385949"/>
       <w:r>
         <w:rPr>
           <w:rFonts w:ascii="Times New Roman" w:hAnsi="Times New Roman"/>
@@ -2221,7 +2221,7 @@
         <w:pStyle w:val="1"/>
         <w:ind w:firstLine="709"/>
       </w:pPr>
-      <w:bookmarkStart w:id="1" w:name="_Toc242378585"/>
+      <w:bookmarkStart w:id="1" w:name="_Toc242385950"/>
       <w:r>
         <w:rPr>
           <w:rFonts w:ascii="Times New Roman" w:hAnsi="Times New Roman"/>
@@ -2523,7 +2523,7 @@
         <w:pStyle w:val="1"/>
         <w:ind w:firstLine="709"/>
       </w:pPr>
-      <w:bookmarkStart w:id="2" w:name="_Toc242378586"/>
+      <w:bookmarkStart w:id="2" w:name="_Toc242385951"/>
       <w:r>
         <w:rPr>
           <w:rFonts w:ascii="Times New Roman" w:hAnsi="Times New Roman"/>
@@ -2539,7 +2539,7 @@
         <w:spacing w:before="360"/>
         <w:ind w:firstLine="709"/>
       </w:pPr>
-      <w:bookmarkStart w:id="3" w:name="_Toc242378587"/>
+      <w:bookmarkStart w:id="3" w:name="_Toc242385952"/>
       <w:r>
         <w:rPr>
           <w:rFonts w:ascii="Times New Roman" w:hAnsi="Times New Roman"/>
@@ -2578,7 +2578,7 @@
         <w:rPr>
           <w:i/>
         </w:rPr>
-        <w:t>net8.0</w:t>
+        <w:t>net10.0</w:t>
       </w:r>
       <w:r>
         <w:t xml:space="preserve"> (</w:t>
@@ -2590,7 +2590,7 @@
         <w:t>SDK</w:t>
       </w:r>
       <w:r>
-        <w:t xml:space="preserve"> 9.0.318). Конфигурационный файл </w:t>
+        <w:t xml:space="preserve"> 10.0.401). Конфигурационный файл </w:t>
       </w:r>
       <w:r>
         <w:rPr>
@@ -2641,7 +2641,7 @@
         <w:rPr>
           <w:i/>
         </w:rPr>
-        <w:t>net8.0</w:t>
+        <w:t>net10.0</w:t>
       </w:r>
       <w:r>
         <w:t>\</w:t>
@@ -2707,7 +2707,7 @@
         <w:spacing w:before="360"/>
         <w:ind w:firstLine="709"/>
       </w:pPr>
-      <w:bookmarkStart w:id="4" w:name="_Toc242378588"/>
+      <w:bookmarkStart w:id="4" w:name="_Toc242385953"/>
       <w:r>
         <w:rPr>
           <w:rFonts w:ascii="Times New Roman" w:hAnsi="Times New Roman"/>
@@ -2754,7 +2754,7 @@
           <w:noProof/>
         </w:rPr>
         <w:drawing>
-          <wp:inline distT="0" distB="0" distL="0" distR="0" wp14:anchorId="130C1C5C" wp14:editId="52A8C140">
+          <wp:inline distT="0" distB="0" distL="0" distR="0" wp14:anchorId="189E016D" wp14:editId="00A97450">
             <wp:extent cx="5580000" cy="3467184"/>
             <wp:effectExtent l="0" t="0" r="0" b="0"/>
             <wp:docPr id="1" name="Picture 1"/>
@@ -2866,7 +2866,7 @@
           <w:noProof/>
         </w:rPr>
         <w:drawing>
-          <wp:inline distT="0" distB="0" distL="0" distR="0" wp14:anchorId="2F0A8732" wp14:editId="41F165ED">
+          <wp:inline distT="0" distB="0" distL="0" distR="0" wp14:anchorId="7FDFE000" wp14:editId="4AA15005">
             <wp:extent cx="5580000" cy="3337165"/>
             <wp:effectExtent l="0" t="0" r="0" b="0"/>
             <wp:docPr id="2" name="Picture 2"/>
@@ -3008,7 +3008,7 @@
         <w:spacing w:before="360"/>
         <w:ind w:firstLine="709"/>
       </w:pPr>
-      <w:bookmarkStart w:id="5" w:name="_Toc242378589"/>
+      <w:bookmarkStart w:id="5" w:name="_Toc242385954"/>
       <w:r>
         <w:rPr>
           <w:rFonts w:ascii="Times New Roman" w:hAnsi="Times New Roman"/>
@@ -3107,7 +3107,7 @@
         </w:rPr>
         <w:lastRenderedPageBreak/>
         <w:drawing>
-          <wp:inline distT="0" distB="0" distL="0" distR="0" wp14:anchorId="64E009FD" wp14:editId="01EC2766">
+          <wp:inline distT="0" distB="0" distL="0" distR="0" wp14:anchorId="2987A41D" wp14:editId="53AFAD46">
             <wp:extent cx="5580000" cy="2557049"/>
             <wp:effectExtent l="0" t="0" r="0" b="0"/>
             <wp:docPr id="3" name="Picture 3"/>
@@ -3231,7 +3231,7 @@
         <w:spacing w:before="360"/>
         <w:ind w:firstLine="709"/>
       </w:pPr>
-      <w:bookmarkStart w:id="6" w:name="_Toc242378590"/>
+      <w:bookmarkStart w:id="6" w:name="_Toc242385955"/>
       <w:r>
         <w:rPr>
           <w:rFonts w:ascii="Times New Roman" w:hAnsi="Times New Roman"/>
@@ -3342,7 +3342,7 @@
         </w:rPr>
         <w:lastRenderedPageBreak/>
         <w:drawing>
-          <wp:inline distT="0" distB="0" distL="0" distR="0" wp14:anchorId="5BB02A87" wp14:editId="105C58E9">
+          <wp:inline distT="0" distB="0" distL="0" distR="0" wp14:anchorId="15972DE0" wp14:editId="63C79CE0">
             <wp:extent cx="5580000" cy="2687068"/>
             <wp:effectExtent l="0" t="0" r="0" b="0"/>
             <wp:docPr id="4" name="Picture 4"/>
@@ -3471,7 +3471,7 @@
           <w:noProof/>
         </w:rPr>
         <w:drawing>
-          <wp:inline distT="0" distB="0" distL="0" distR="0" wp14:anchorId="41CBA149" wp14:editId="3BF741AA">
+          <wp:inline distT="0" distB="0" distL="0" distR="0" wp14:anchorId="7BDA278C" wp14:editId="7B2C0E75">
             <wp:extent cx="5580000" cy="2557049"/>
             <wp:effectExtent l="0" t="0" r="0" b="0"/>
             <wp:docPr id="5" name="Picture 5"/>
@@ -3589,7 +3589,7 @@
         <w:spacing w:before="360"/>
         <w:ind w:firstLine="709"/>
       </w:pPr>
-      <w:bookmarkStart w:id="7" w:name="_Toc242378591"/>
+      <w:bookmarkStart w:id="7" w:name="_Toc242385956"/>
       <w:r>
         <w:rPr>
           <w:rFonts w:ascii="Times New Roman" w:hAnsi="Times New Roman"/>
@@ -3704,448 +3704,298 @@
     </w:p>
     <w:p>
       <w:pPr>
-        <w:spacing w:line="240" w:lineRule="auto"/>
-      </w:pPr>
-      <w:r>
-        <w:rPr>
-          <w:i/>
-          <w:sz w:val="24"/>
-        </w:rPr>
+        <w:pStyle w:val="Listing"/>
+      </w:pPr>
+      <w:r>
         <w:t>// Задание 1: класс с тремя приватными полями разных типов и свойствами с валидацией</w:t>
       </w:r>
     </w:p>
     <w:p>
       <w:pPr>
-        <w:spacing w:line="240" w:lineRule="auto"/>
-      </w:pPr>
-      <w:r>
-        <w:rPr>
-          <w:i/>
-          <w:sz w:val="24"/>
-        </w:rPr>
+        <w:pStyle w:val="Listing"/>
+      </w:pPr>
+      <w:r>
         <w:t>public class ReflectionTarget</w:t>
       </w:r>
     </w:p>
     <w:p>
       <w:pPr>
-        <w:spacing w:line="240" w:lineRule="auto"/>
-      </w:pPr>
-      <w:r>
-        <w:rPr>
-          <w:i/>
-          <w:sz w:val="24"/>
-        </w:rPr>
+        <w:pStyle w:val="Listing"/>
+      </w:pPr>
+      <w:r>
         <w:t>{</w:t>
       </w:r>
     </w:p>
     <w:p>
       <w:pPr>
-        <w:spacing w:line="240" w:lineRule="auto"/>
-      </w:pPr>
-      <w:r>
-        <w:rPr>
-          <w:i/>
-          <w:sz w:val="24"/>
-        </w:rPr>
+        <w:pStyle w:val="Listing"/>
+      </w:pPr>
+      <w:r>
         <w:t xml:space="preserve">    private int _age;</w:t>
       </w:r>
     </w:p>
     <w:p>
       <w:pPr>
-        <w:spacing w:line="240" w:lineRule="auto"/>
-      </w:pPr>
-      <w:r>
-        <w:rPr>
-          <w:i/>
-          <w:sz w:val="24"/>
-        </w:rPr>
+        <w:pStyle w:val="Listing"/>
+      </w:pPr>
+      <w:r>
         <w:t xml:space="preserve">    private string _name;</w:t>
       </w:r>
     </w:p>
     <w:p>
       <w:pPr>
-        <w:spacing w:line="240" w:lineRule="auto"/>
-      </w:pPr>
-      <w:r>
-        <w:rPr>
-          <w:i/>
-          <w:sz w:val="24"/>
-        </w:rPr>
-        <w:t xml:space="preserve">    </w:t>
-      </w:r>
-      <w:r>
-        <w:rPr>
-          <w:i/>
-          <w:sz w:val="24"/>
-        </w:rPr>
-        <w:t>private double _rating;</w:t>
-      </w:r>
-    </w:p>
-    <w:p>
-      <w:pPr>
-        <w:spacing w:line="240" w:lineRule="auto"/>
-      </w:pPr>
-    </w:p>
-    <w:p>
-      <w:pPr>
-        <w:spacing w:line="240" w:lineRule="auto"/>
-      </w:pPr>
-      <w:r>
-        <w:rPr>
-          <w:i/>
-          <w:sz w:val="24"/>
-        </w:rPr>
+        <w:pStyle w:val="Listing"/>
+      </w:pPr>
+      <w:r>
+        <w:t xml:space="preserve">    private double _rating;</w:t>
+      </w:r>
+    </w:p>
+    <w:p>
+      <w:pPr>
+        <w:pStyle w:val="Listing"/>
+      </w:pPr>
+    </w:p>
+    <w:p>
+      <w:pPr>
+        <w:pStyle w:val="Listing"/>
+      </w:pPr>
+      <w:r>
         <w:t xml:space="preserve">    public ReflectionTarget()</w:t>
       </w:r>
     </w:p>
     <w:p>
       <w:pPr>
-        <w:spacing w:line="240" w:lineRule="auto"/>
-      </w:pPr>
-      <w:r>
-        <w:rPr>
-          <w:i/>
-          <w:sz w:val="24"/>
-        </w:rPr>
+        <w:pStyle w:val="Listing"/>
+      </w:pPr>
+      <w:r>
         <w:t xml:space="preserve">    {</w:t>
       </w:r>
     </w:p>
     <w:p>
       <w:pPr>
-        <w:spacing w:line="240" w:lineRule="auto"/>
-      </w:pPr>
-      <w:r>
-        <w:rPr>
-          <w:i/>
-          <w:sz w:val="24"/>
-        </w:rPr>
+        <w:pStyle w:val="Listing"/>
+      </w:pPr>
+      <w:r>
         <w:t xml:space="preserve">        _name = "Unknown";</w:t>
       </w:r>
     </w:p>
     <w:p>
       <w:pPr>
-        <w:spacing w:line="240" w:lineRule="auto"/>
-      </w:pPr>
-      <w:r>
-        <w:rPr>
-          <w:i/>
-          <w:sz w:val="24"/>
-        </w:rPr>
+        <w:pStyle w:val="Listing"/>
+      </w:pPr>
+      <w:r>
         <w:t xml:space="preserve">    }</w:t>
       </w:r>
     </w:p>
     <w:p>
       <w:pPr>
-        <w:spacing w:line="240" w:lineRule="auto"/>
-      </w:pPr>
-    </w:p>
-    <w:p>
-      <w:pPr>
-        <w:spacing w:line="240" w:lineRule="auto"/>
-      </w:pPr>
-      <w:r>
-        <w:rPr>
-          <w:i/>
-          <w:sz w:val="24"/>
-        </w:rPr>
+        <w:pStyle w:val="Listing"/>
+      </w:pPr>
+    </w:p>
+    <w:p>
+      <w:pPr>
+        <w:pStyle w:val="Listing"/>
+      </w:pPr>
+      <w:r>
         <w:t xml:space="preserve">    public ReflectionTarget(int age, string name, double rating)</w:t>
       </w:r>
     </w:p>
     <w:p>
       <w:pPr>
-        <w:spacing w:line="240" w:lineRule="auto"/>
-      </w:pPr>
-      <w:r>
-        <w:rPr>
-          <w:i/>
-          <w:sz w:val="24"/>
-        </w:rPr>
+        <w:pStyle w:val="Listing"/>
+      </w:pPr>
+      <w:r>
         <w:t xml:space="preserve">    {</w:t>
       </w:r>
     </w:p>
     <w:p>
       <w:pPr>
-        <w:spacing w:line="240" w:lineRule="auto"/>
-      </w:pPr>
-      <w:r>
-        <w:rPr>
-          <w:i/>
-          <w:sz w:val="24"/>
-        </w:rPr>
+        <w:pStyle w:val="Listing"/>
+      </w:pPr>
+      <w:r>
         <w:t xml:space="preserve">        Age = age;</w:t>
       </w:r>
     </w:p>
     <w:p>
       <w:pPr>
-        <w:spacing w:line="240" w:lineRule="auto"/>
-      </w:pPr>
-      <w:r>
-        <w:rPr>
-          <w:i/>
-          <w:sz w:val="24"/>
-        </w:rPr>
+        <w:pStyle w:val="Listing"/>
+      </w:pPr>
+      <w:r>
         <w:t xml:space="preserve">        Name = name;</w:t>
       </w:r>
     </w:p>
     <w:p>
       <w:pPr>
-        <w:spacing w:line="240" w:lineRule="auto"/>
-      </w:pPr>
-      <w:r>
-        <w:rPr>
-          <w:i/>
-          <w:sz w:val="24"/>
-        </w:rPr>
+        <w:pStyle w:val="Listing"/>
+      </w:pPr>
+      <w:r>
         <w:t xml:space="preserve">        Rating = rating;</w:t>
       </w:r>
     </w:p>
     <w:p>
       <w:pPr>
-        <w:spacing w:line="240" w:lineRule="auto"/>
-      </w:pPr>
-      <w:r>
-        <w:rPr>
-          <w:i/>
-          <w:sz w:val="24"/>
-        </w:rPr>
+        <w:pStyle w:val="Listing"/>
+      </w:pPr>
+      <w:r>
         <w:t xml:space="preserve">    }</w:t>
       </w:r>
     </w:p>
     <w:p>
       <w:pPr>
-        <w:spacing w:line="240" w:lineRule="auto"/>
-      </w:pPr>
-    </w:p>
-    <w:p>
-      <w:pPr>
-        <w:spacing w:line="240" w:lineRule="auto"/>
-      </w:pPr>
-      <w:r>
-        <w:rPr>
-          <w:i/>
-          <w:sz w:val="24"/>
-        </w:rPr>
+        <w:pStyle w:val="Listing"/>
+      </w:pPr>
+    </w:p>
+    <w:p>
+      <w:pPr>
+        <w:pStyle w:val="Listing"/>
+      </w:pPr>
+      <w:r>
         <w:t xml:space="preserve">    // Возраст не может быть меньше нуля</w:t>
       </w:r>
     </w:p>
     <w:p>
       <w:pPr>
-        <w:spacing w:line="240" w:lineRule="auto"/>
-      </w:pPr>
-      <w:r>
-        <w:rPr>
-          <w:i/>
-          <w:sz w:val="24"/>
-        </w:rPr>
+        <w:pStyle w:val="Listing"/>
+      </w:pPr>
+      <w:r>
         <w:t xml:space="preserve">    public int Age</w:t>
       </w:r>
     </w:p>
     <w:p>
       <w:pPr>
-        <w:spacing w:line="240" w:lineRule="auto"/>
-      </w:pPr>
-      <w:r>
-        <w:rPr>
-          <w:i/>
-          <w:sz w:val="24"/>
-        </w:rPr>
+        <w:pStyle w:val="Listing"/>
+      </w:pPr>
+      <w:r>
         <w:t xml:space="preserve">    {</w:t>
       </w:r>
     </w:p>
     <w:p>
       <w:pPr>
-        <w:spacing w:line="240" w:lineRule="auto"/>
-      </w:pPr>
-      <w:r>
-        <w:rPr>
-          <w:i/>
-          <w:sz w:val="24"/>
-        </w:rPr>
+        <w:pStyle w:val="Listing"/>
+      </w:pPr>
+      <w:r>
         <w:t xml:space="preserve">        get { return _age; }</w:t>
       </w:r>
     </w:p>
     <w:p>
       <w:pPr>
-        <w:spacing w:line="240" w:lineRule="auto"/>
-      </w:pPr>
-      <w:r>
-        <w:rPr>
-          <w:i/>
-          <w:sz w:val="24"/>
-        </w:rPr>
+        <w:pStyle w:val="Listing"/>
+      </w:pPr>
+      <w:r>
         <w:t xml:space="preserve">        set { _age = value &lt; 0 ? 0 : value; }</w:t>
       </w:r>
     </w:p>
     <w:p>
       <w:pPr>
-        <w:spacing w:line="240" w:lineRule="auto"/>
-      </w:pPr>
-      <w:r>
-        <w:rPr>
-          <w:i/>
-          <w:sz w:val="24"/>
-        </w:rPr>
+        <w:pStyle w:val="Listing"/>
+      </w:pPr>
+      <w:r>
         <w:t xml:space="preserve">    }</w:t>
       </w:r>
     </w:p>
     <w:p>
       <w:pPr>
-        <w:spacing w:line="240" w:lineRule="auto"/>
-      </w:pPr>
-    </w:p>
-    <w:p>
-      <w:pPr>
-        <w:spacing w:line="240" w:lineRule="auto"/>
-      </w:pPr>
-      <w:r>
-        <w:rPr>
-          <w:i/>
-          <w:sz w:val="24"/>
-        </w:rPr>
+        <w:pStyle w:val="Listing"/>
+      </w:pPr>
+    </w:p>
+    <w:p>
+      <w:pPr>
+        <w:pStyle w:val="Listing"/>
+      </w:pPr>
+      <w:r>
         <w:t xml:space="preserve">    // Пустое имя заменяется на Unknown</w:t>
       </w:r>
     </w:p>
     <w:p>
       <w:pPr>
-        <w:spacing w:line="240" w:lineRule="auto"/>
-      </w:pPr>
-      <w:r>
-        <w:rPr>
-          <w:i/>
-          <w:sz w:val="24"/>
-        </w:rPr>
+        <w:pStyle w:val="Listing"/>
+      </w:pPr>
+      <w:r>
         <w:t xml:space="preserve">    public string Name</w:t>
       </w:r>
     </w:p>
     <w:p>
       <w:pPr>
-        <w:spacing w:line="240" w:lineRule="auto"/>
-      </w:pPr>
-      <w:r>
-        <w:rPr>
-          <w:i/>
-          <w:sz w:val="24"/>
-        </w:rPr>
+        <w:pStyle w:val="Listing"/>
+      </w:pPr>
+      <w:r>
         <w:t xml:space="preserve">    {</w:t>
       </w:r>
     </w:p>
     <w:p>
       <w:pPr>
-        <w:spacing w:line="240" w:lineRule="auto"/>
-      </w:pPr>
-      <w:r>
-        <w:rPr>
-          <w:i/>
-          <w:sz w:val="24"/>
-        </w:rPr>
+        <w:pStyle w:val="Listing"/>
+      </w:pPr>
+      <w:r>
         <w:t xml:space="preserve">        get { return _name; }</w:t>
       </w:r>
     </w:p>
     <w:p>
       <w:pPr>
-        <w:spacing w:line="240" w:lineRule="auto"/>
-      </w:pPr>
-      <w:r>
-        <w:rPr>
-          <w:i/>
-          <w:sz w:val="24"/>
-        </w:rPr>
-        <w:t xml:space="preserve">        set { _name = </w:t>
-      </w:r>
-      <w:r>
-        <w:rPr>
-          <w:i/>
-          <w:sz w:val="24"/>
-        </w:rPr>
-        <w:t>string.IsNullOrWhiteSpace(value) ? "Unknown" : value; }</w:t>
-      </w:r>
-    </w:p>
-    <w:p>
-      <w:pPr>
-        <w:spacing w:line="240" w:lineRule="auto"/>
-      </w:pPr>
-      <w:r>
-        <w:rPr>
-          <w:i/>
-          <w:sz w:val="24"/>
-        </w:rPr>
+        <w:pStyle w:val="Listing"/>
+      </w:pPr>
+      <w:r>
+        <w:t xml:space="preserve">        set { _name = string.IsNullOrWhiteSpace(value) ? "Unknown" : value; }</w:t>
+      </w:r>
+    </w:p>
+    <w:p>
+      <w:pPr>
+        <w:pStyle w:val="Listing"/>
+      </w:pPr>
+      <w:r>
         <w:t xml:space="preserve">    }</w:t>
       </w:r>
     </w:p>
     <w:p>
       <w:pPr>
-        <w:spacing w:line="240" w:lineRule="auto"/>
-      </w:pPr>
-    </w:p>
-    <w:p>
-      <w:pPr>
-        <w:spacing w:line="240" w:lineRule="auto"/>
-      </w:pPr>
-      <w:r>
-        <w:rPr>
-          <w:i/>
-          <w:sz w:val="24"/>
-        </w:rPr>
+        <w:pStyle w:val="Listing"/>
+      </w:pPr>
+    </w:p>
+    <w:p>
+      <w:pPr>
+        <w:pStyle w:val="Listing"/>
+      </w:pPr>
+      <w:r>
         <w:t xml:space="preserve">    // Рейтинг ограничивается диапазоном от 0 до 5</w:t>
       </w:r>
     </w:p>
     <w:p>
       <w:pPr>
-        <w:spacing w:line="240" w:lineRule="auto"/>
-      </w:pPr>
-      <w:r>
-        <w:rPr>
-          <w:i/>
-          <w:sz w:val="24"/>
-        </w:rPr>
+        <w:pStyle w:val="Listing"/>
+      </w:pPr>
+      <w:r>
         <w:t xml:space="preserve">    public double Rating</w:t>
       </w:r>
     </w:p>
     <w:p>
       <w:pPr>
-        <w:spacing w:line="240" w:lineRule="auto"/>
-      </w:pPr>
-      <w:r>
-        <w:rPr>
-          <w:i/>
-          <w:sz w:val="24"/>
-        </w:rPr>
+        <w:pStyle w:val="Listing"/>
+      </w:pPr>
+      <w:r>
         <w:t xml:space="preserve">    {</w:t>
       </w:r>
     </w:p>
     <w:p>
       <w:pPr>
-        <w:spacing w:line="240" w:lineRule="auto"/>
-      </w:pPr>
-      <w:r>
-        <w:rPr>
-          <w:i/>
-          <w:sz w:val="24"/>
-        </w:rPr>
+        <w:pStyle w:val="Listing"/>
+      </w:pPr>
+      <w:r>
         <w:t xml:space="preserve">        get { return _rating; }</w:t>
       </w:r>
     </w:p>
     <w:p>
       <w:pPr>
-        <w:spacing w:line="240" w:lineRule="auto"/>
-      </w:pPr>
-      <w:r>
-        <w:rPr>
-          <w:i/>
-          <w:sz w:val="24"/>
-        </w:rPr>
+        <w:pStyle w:val="Listing"/>
+      </w:pPr>
+      <w:r>
         <w:t xml:space="preserve">        set { _rating = value &lt; 0 ? 0 : (value &gt; 5 ? 5 : value); }</w:t>
       </w:r>
     </w:p>
     <w:p>
       <w:pPr>
-        <w:spacing w:line="240" w:lineRule="auto"/>
-      </w:pPr>
-      <w:r>
-        <w:rPr>
-          <w:i/>
-          <w:sz w:val="24"/>
-        </w:rPr>
+        <w:pStyle w:val="Listing"/>
+      </w:pPr>
+      <w:r>
         <w:t xml:space="preserve">    }</w:t>
       </w:r>
     </w:p>
@@ -4156,6 +4006,7 @@
         <w:jc w:val="both"/>
       </w:pPr>
       <w:r>
+        <w:lastRenderedPageBreak/>
         <w:t>Проверка валидации показана на рисунке 3.6.</w:t>
       </w:r>
     </w:p>
@@ -4170,7 +4021,7 @@
           <w:noProof/>
         </w:rPr>
         <w:drawing>
-          <wp:inline distT="0" distB="0" distL="0" distR="0" wp14:anchorId="179EEFED" wp14:editId="4767106B">
+          <wp:inline distT="0" distB="0" distL="0" distR="0" wp14:anchorId="64338E38" wp14:editId="28E3F3F4">
             <wp:extent cx="5580000" cy="1126835"/>
             <wp:effectExtent l="0" t="0" r="0" b="0"/>
             <wp:docPr id="6" name="Picture 6"/>
@@ -4249,7 +4100,7 @@
         <w:spacing w:before="360"/>
         <w:ind w:firstLine="709"/>
       </w:pPr>
-      <w:bookmarkStart w:id="8" w:name="_Toc242378592"/>
+      <w:bookmarkStart w:id="8" w:name="_Toc242385957"/>
       <w:r>
         <w:rPr>
           <w:rFonts w:ascii="Times New Roman" w:hAnsi="Times New Roman"/>
@@ -4357,437 +4208,291 @@
     </w:p>
     <w:p>
       <w:pPr>
-        <w:spacing w:line="240" w:lineRule="auto"/>
-      </w:pPr>
-      <w:r>
-        <w:rPr>
-          <w:i/>
-          <w:sz w:val="24"/>
-        </w:rPr>
+        <w:pStyle w:val="Listing"/>
+      </w:pPr>
+      <w:r>
         <w:t>// Задание 2: информация о всех методах класса</w:t>
       </w:r>
     </w:p>
     <w:p>
       <w:pPr>
-        <w:spacing w:line="240" w:lineRule="auto"/>
-      </w:pPr>
-      <w:r>
-        <w:rPr>
-          <w:i/>
-          <w:sz w:val="24"/>
-        </w:rPr>
+        <w:pStyle w:val="Listing"/>
+      </w:pPr>
+      <w:r>
         <w:t>public static void Task2()</w:t>
       </w:r>
     </w:p>
     <w:p>
       <w:pPr>
-        <w:spacing w:line="240" w:lineRule="auto"/>
-      </w:pPr>
-      <w:r>
-        <w:rPr>
-          <w:i/>
-          <w:sz w:val="24"/>
-        </w:rPr>
+        <w:pStyle w:val="Listing"/>
+      </w:pPr>
+      <w:r>
         <w:t>{</w:t>
       </w:r>
     </w:p>
     <w:p>
       <w:pPr>
-        <w:spacing w:line="240" w:lineRule="auto"/>
-      </w:pPr>
-      <w:r>
-        <w:rPr>
-          <w:i/>
-          <w:sz w:val="24"/>
-        </w:rPr>
+        <w:pStyle w:val="Listing"/>
+      </w:pPr>
+      <w:r>
         <w:t xml:space="preserve">    Console.WriteLine("\n=== ЗАДАНИЕ 2: МЕТОДЫ КЛАССА ЧЕРЕЗ РЕФЛЕКСИЮ ===\n");</w:t>
       </w:r>
     </w:p>
     <w:p>
       <w:pPr>
-        <w:spacing w:line="240" w:lineRule="auto"/>
-      </w:pPr>
-    </w:p>
-    <w:p>
-      <w:pPr>
-        <w:spacing w:line="240" w:lineRule="auto"/>
-      </w:pPr>
-      <w:r>
-        <w:rPr>
-          <w:i/>
-          <w:sz w:val="24"/>
-        </w:rPr>
+        <w:pStyle w:val="Listing"/>
+      </w:pPr>
+    </w:p>
+    <w:p>
+      <w:pPr>
+        <w:pStyle w:val="Listing"/>
+      </w:pPr>
+      <w:r>
         <w:t xml:space="preserve">    // Класс DynamicCalculator содержит публичные, приватные, статические и экземплярные методы</w:t>
       </w:r>
     </w:p>
     <w:p>
       <w:pPr>
-        <w:spacing w:line="240" w:lineRule="auto"/>
-      </w:pPr>
-      <w:r>
-        <w:rPr>
-          <w:i/>
-          <w:sz w:val="24"/>
-        </w:rPr>
+        <w:pStyle w:val="Listing"/>
+      </w:pPr>
+      <w:r>
         <w:t xml:space="preserve">    Type type = typeof(DynamicCalculator);</w:t>
       </w:r>
     </w:p>
     <w:p>
       <w:pPr>
-        <w:spacing w:line="240" w:lineRule="auto"/>
-      </w:pPr>
-    </w:p>
-    <w:p>
-      <w:pPr>
-        <w:spacing w:line="240" w:lineRule="auto"/>
-      </w:pPr>
-      <w:r>
-        <w:rPr>
-          <w:i/>
-          <w:sz w:val="24"/>
-        </w:rPr>
+        <w:pStyle w:val="Listing"/>
+      </w:pPr>
+    </w:p>
+    <w:p>
+      <w:pPr>
+        <w:pStyle w:val="Listing"/>
+      </w:pPr>
+      <w:r>
         <w:t xml:space="preserve">    // Все методы: публичные, приватные, статические, экземплярные</w:t>
       </w:r>
     </w:p>
     <w:p>
       <w:pPr>
-        <w:spacing w:line="240" w:lineRule="auto"/>
-      </w:pPr>
-      <w:r>
-        <w:rPr>
-          <w:i/>
-          <w:sz w:val="24"/>
-        </w:rPr>
+        <w:pStyle w:val="Listing"/>
+      </w:pPr>
+      <w:r>
         <w:t xml:space="preserve">    MethodInfo[] allMethods = type.GetMethods(</w:t>
       </w:r>
     </w:p>
     <w:p>
       <w:pPr>
-        <w:spacing w:line="240" w:lineRule="auto"/>
-      </w:pPr>
-      <w:r>
-        <w:rPr>
-          <w:i/>
-          <w:sz w:val="24"/>
-        </w:rPr>
+        <w:pStyle w:val="Listing"/>
+      </w:pPr>
+      <w:r>
         <w:t xml:space="preserve">        BindingFlags.Public |</w:t>
       </w:r>
     </w:p>
     <w:p>
       <w:pPr>
-        <w:spacing w:line="240" w:lineRule="auto"/>
-      </w:pPr>
-      <w:r>
-        <w:rPr>
-          <w:i/>
-          <w:sz w:val="24"/>
-        </w:rPr>
+        <w:pStyle w:val="Listing"/>
+      </w:pPr>
+      <w:r>
         <w:t xml:space="preserve">        BindingFlags.NonPublic |</w:t>
       </w:r>
     </w:p>
     <w:p>
       <w:pPr>
-        <w:spacing w:line="240" w:lineRule="auto"/>
-      </w:pPr>
-      <w:r>
-        <w:rPr>
-          <w:i/>
-          <w:sz w:val="24"/>
-        </w:rPr>
+        <w:pStyle w:val="Listing"/>
+      </w:pPr>
+      <w:r>
         <w:t xml:space="preserve">        BindingFlags.Instance |</w:t>
       </w:r>
     </w:p>
     <w:p>
       <w:pPr>
-        <w:spacing w:line="240" w:lineRule="auto"/>
-      </w:pPr>
-      <w:r>
-        <w:rPr>
-          <w:i/>
-          <w:sz w:val="24"/>
-        </w:rPr>
+        <w:pStyle w:val="Listing"/>
+      </w:pPr>
+      <w:r>
         <w:t xml:space="preserve">        BindingFlags.Static);</w:t>
       </w:r>
     </w:p>
     <w:p>
       <w:pPr>
-        <w:spacing w:line="240" w:lineRule="auto"/>
-      </w:pPr>
-    </w:p>
-    <w:p>
-      <w:pPr>
-        <w:spacing w:line="240" w:lineRule="auto"/>
-      </w:pPr>
-      <w:r>
-        <w:rPr>
-          <w:i/>
-          <w:sz w:val="24"/>
-        </w:rPr>
+        <w:pStyle w:val="Listing"/>
+      </w:pPr>
+    </w:p>
+    <w:p>
+      <w:pPr>
+        <w:pStyle w:val="Listing"/>
+      </w:pPr>
+      <w:r>
         <w:t xml:space="preserve">    Console.WriteLine("Все методы (BindingFlags.Public | NonPublic | Instance | Static):");</w:t>
       </w:r>
     </w:p>
     <w:p>
       <w:pPr>
-        <w:spacing w:line="240" w:lineRule="auto"/>
-      </w:pPr>
-      <w:r>
-        <w:rPr>
-          <w:i/>
-          <w:sz w:val="24"/>
-        </w:rPr>
+        <w:pStyle w:val="Listing"/>
+      </w:pPr>
+      <w:r>
         <w:t xml:space="preserve">    foreach (MethodInfo method in allMethods)</w:t>
       </w:r>
     </w:p>
     <w:p>
       <w:pPr>
-        <w:spacing w:line="240" w:lineRule="auto"/>
-      </w:pPr>
-      <w:r>
-        <w:rPr>
-          <w:i/>
-          <w:sz w:val="24"/>
-        </w:rPr>
+        <w:pStyle w:val="Listing"/>
+      </w:pPr>
+      <w:r>
         <w:t xml:space="preserve">    {</w:t>
       </w:r>
     </w:p>
     <w:p>
       <w:pPr>
-        <w:spacing w:line="240" w:lineRule="auto"/>
-      </w:pPr>
-      <w:r>
-        <w:rPr>
-          <w:i/>
-          <w:sz w:val="24"/>
-        </w:rPr>
+        <w:pStyle w:val="Listing"/>
+      </w:pPr>
+      <w:r>
         <w:t xml:space="preserve">        // Отфильтровываем методы, сгенерированные для свойств</w:t>
       </w:r>
     </w:p>
     <w:p>
       <w:pPr>
-        <w:spacing w:line="240" w:lineRule="auto"/>
-      </w:pPr>
-      <w:r>
-        <w:rPr>
-          <w:i/>
-          <w:sz w:val="24"/>
-        </w:rPr>
+        <w:pStyle w:val="Listing"/>
+      </w:pPr>
+      <w:r>
+        <w:t xml:space="preserve">        if (method.Name.StartsWith("get_") || method.Name.StartsWith("set_"))</w:t>
+      </w:r>
+    </w:p>
+    <w:p>
+      <w:pPr>
+        <w:pStyle w:val="Listing"/>
+      </w:pPr>
+      <w:r>
         <w:lastRenderedPageBreak/>
-        <w:t xml:space="preserve">        if (method.Name.StartsWith("get_") || method.Name.StartsWith("set_"))</w:t>
-      </w:r>
-    </w:p>
-    <w:p>
-      <w:pPr>
-        <w:spacing w:line="240" w:lineRule="auto"/>
-      </w:pPr>
-      <w:r>
-        <w:rPr>
-          <w:i/>
-          <w:sz w:val="24"/>
-        </w:rPr>
         <w:t xml:space="preserve">            continue;</w:t>
       </w:r>
     </w:p>
     <w:p>
       <w:pPr>
-        <w:spacing w:line="240" w:lineRule="auto"/>
-      </w:pPr>
-    </w:p>
-    <w:p>
-      <w:pPr>
-        <w:spacing w:line="240" w:lineRule="auto"/>
-      </w:pPr>
-      <w:r>
-        <w:rPr>
-          <w:i/>
-          <w:sz w:val="24"/>
-        </w:rPr>
+        <w:pStyle w:val="Listing"/>
+      </w:pPr>
+    </w:p>
+    <w:p>
+      <w:pPr>
+        <w:pStyle w:val="Listing"/>
+      </w:pPr>
+      <w:r>
         <w:t xml:space="preserve">        string access = method.IsPublic ? "public" : (method.IsPrivate ? "private" : "protected");</w:t>
       </w:r>
     </w:p>
     <w:p>
       <w:pPr>
-        <w:spacing w:line="240" w:lineRule="auto"/>
-      </w:pPr>
-      <w:r>
-        <w:rPr>
-          <w:i/>
-          <w:sz w:val="24"/>
-        </w:rPr>
+        <w:pStyle w:val="Listing"/>
+      </w:pPr>
+      <w:r>
         <w:t xml:space="preserve">        string isStatic = method.IsStatic ? " static" : "";</w:t>
       </w:r>
     </w:p>
     <w:p>
       <w:pPr>
-        <w:spacing w:line="240" w:lineRule="auto"/>
-      </w:pPr>
-      <w:r>
-        <w:rPr>
-          <w:i/>
-          <w:sz w:val="24"/>
-        </w:rPr>
-        <w:t xml:space="preserve">        </w:t>
-      </w:r>
-      <w:r>
-        <w:rPr>
-          <w:i/>
-          <w:sz w:val="24"/>
-        </w:rPr>
-        <w:t>string parameters = string.Join(", ",</w:t>
-      </w:r>
-    </w:p>
-    <w:p>
-      <w:pPr>
-        <w:spacing w:line="240" w:lineRule="auto"/>
-      </w:pPr>
-      <w:r>
-        <w:rPr>
-          <w:i/>
-          <w:sz w:val="24"/>
-        </w:rPr>
+        <w:pStyle w:val="Listing"/>
+      </w:pPr>
+      <w:r>
+        <w:t xml:space="preserve">        string parameters = string.Join(", ",</w:t>
+      </w:r>
+    </w:p>
+    <w:p>
+      <w:pPr>
+        <w:pStyle w:val="Listing"/>
+      </w:pPr>
+      <w:r>
         <w:t xml:space="preserve">            method.GetParameters().Select(p =&gt; $"{p.ParameterType.Name} {p.Name}"));</w:t>
       </w:r>
     </w:p>
     <w:p>
       <w:pPr>
-        <w:spacing w:line="240" w:lineRule="auto"/>
-      </w:pPr>
-      <w:r>
-        <w:rPr>
-          <w:i/>
-          <w:sz w:val="24"/>
-        </w:rPr>
+        <w:pStyle w:val="Listing"/>
+      </w:pPr>
+      <w:r>
         <w:t xml:space="preserve">        Console.WriteLine($"  {access}{isStatic} {method.ReturnType.Name} {method.Name}({parameters})");</w:t>
       </w:r>
     </w:p>
     <w:p>
       <w:pPr>
-        <w:spacing w:line="240" w:lineRule="auto"/>
-      </w:pPr>
-      <w:r>
-        <w:rPr>
-          <w:i/>
-          <w:sz w:val="24"/>
-        </w:rPr>
+        <w:pStyle w:val="Listing"/>
+      </w:pPr>
+      <w:r>
         <w:t xml:space="preserve">    }</w:t>
       </w:r>
     </w:p>
     <w:p>
       <w:pPr>
-        <w:spacing w:line="240" w:lineRule="auto"/>
-      </w:pPr>
-    </w:p>
-    <w:p>
-      <w:pPr>
-        <w:spacing w:line="240" w:lineRule="auto"/>
-      </w:pPr>
-      <w:r>
-        <w:rPr>
-          <w:i/>
-          <w:sz w:val="24"/>
-        </w:rPr>
+        <w:pStyle w:val="Listing"/>
+      </w:pPr>
+    </w:p>
+    <w:p>
+      <w:pPr>
+        <w:pStyle w:val="Listing"/>
+      </w:pPr>
+      <w:r>
         <w:t xml:space="preserve">    // Разница между флагами привязки</w:t>
       </w:r>
     </w:p>
     <w:p>
       <w:pPr>
-        <w:spacing w:line="240" w:lineRule="auto"/>
-      </w:pPr>
-      <w:r>
-        <w:rPr>
-          <w:i/>
-          <w:sz w:val="24"/>
-        </w:rPr>
+        <w:pStyle w:val="Listing"/>
+      </w:pPr>
+      <w:r>
         <w:t xml:space="preserve">    int publicInstance = type.GetMethods(BindingFlags.Public | BindingFlags.Instance).Length;</w:t>
       </w:r>
     </w:p>
     <w:p>
       <w:pPr>
-        <w:spacing w:line="240" w:lineRule="auto"/>
-      </w:pPr>
-      <w:r>
-        <w:rPr>
-          <w:i/>
-          <w:sz w:val="24"/>
-        </w:rPr>
+        <w:pStyle w:val="Listing"/>
+      </w:pPr>
+      <w:r>
         <w:t xml:space="preserve">    int nonPublicInstance = type.GetMethods(BindingFlags.NonPublic | BindingFlags.Instance).Length;</w:t>
       </w:r>
     </w:p>
     <w:p>
       <w:pPr>
-        <w:spacing w:line="240" w:lineRule="auto"/>
-      </w:pPr>
-      <w:r>
-        <w:rPr>
-          <w:i/>
-          <w:sz w:val="24"/>
-        </w:rPr>
-        <w:t xml:space="preserve">    int publicStatic = type.GetMethods(</w:t>
-      </w:r>
-      <w:r>
-        <w:rPr>
-          <w:i/>
-          <w:sz w:val="24"/>
-        </w:rPr>
-        <w:t>BindingFlags.Public | BindingFlags.Static).Length;</w:t>
-      </w:r>
-    </w:p>
-    <w:p>
-      <w:pPr>
-        <w:spacing w:line="240" w:lineRule="auto"/>
-      </w:pPr>
-      <w:r>
-        <w:rPr>
-          <w:i/>
-          <w:sz w:val="24"/>
-        </w:rPr>
+        <w:pStyle w:val="Listing"/>
+      </w:pPr>
+      <w:r>
+        <w:t xml:space="preserve">    int publicStatic = type.GetMethods(BindingFlags.Public | BindingFlags.Static).Length;</w:t>
+      </w:r>
+    </w:p>
+    <w:p>
+      <w:pPr>
+        <w:pStyle w:val="Listing"/>
+      </w:pPr>
+      <w:r>
         <w:t xml:space="preserve">    Console.WriteLine("\nРазница между флагами привязки (с учётом get_/set_ и методов object):");</w:t>
       </w:r>
     </w:p>
     <w:p>
       <w:pPr>
-        <w:spacing w:line="240" w:lineRule="auto"/>
-      </w:pPr>
-      <w:r>
-        <w:rPr>
-          <w:i/>
-          <w:sz w:val="24"/>
-        </w:rPr>
+        <w:pStyle w:val="Listing"/>
+      </w:pPr>
+      <w:r>
         <w:t xml:space="preserve">    Console.WriteLine($"  Public | Instance:    {publicInstance} методов");</w:t>
       </w:r>
     </w:p>
     <w:p>
       <w:pPr>
-        <w:spacing w:line="240" w:lineRule="auto"/>
-      </w:pPr>
-      <w:r>
-        <w:rPr>
-          <w:i/>
-          <w:sz w:val="24"/>
-        </w:rPr>
+        <w:pStyle w:val="Listing"/>
+      </w:pPr>
+      <w:r>
         <w:t xml:space="preserve">    Console.WriteLine($"  NonPublic | Instance: {nonPublicInstance} методов");</w:t>
       </w:r>
     </w:p>
     <w:p>
       <w:pPr>
-        <w:spacing w:line="240" w:lineRule="auto"/>
-      </w:pPr>
-      <w:r>
-        <w:rPr>
-          <w:i/>
-          <w:sz w:val="24"/>
-        </w:rPr>
+        <w:pStyle w:val="Listing"/>
+      </w:pPr>
+      <w:r>
         <w:t xml:space="preserve">    Console.WriteLine($"  Public | Static:     {publicStatic} методов");</w:t>
       </w:r>
     </w:p>
     <w:p>
       <w:pPr>
-        <w:spacing w:line="240" w:lineRule="auto"/>
-      </w:pPr>
-      <w:r>
-        <w:rPr>
-          <w:i/>
-          <w:sz w:val="24"/>
-        </w:rPr>
+        <w:pStyle w:val="Listing"/>
+      </w:pPr>
+      <w:r>
         <w:t>}</w:t>
       </w:r>
     </w:p>
@@ -4812,7 +4517,7 @@
           <w:noProof/>
         </w:rPr>
         <w:drawing>
-          <wp:inline distT="0" distB="0" distL="0" distR="0" wp14:anchorId="57EDB0FC" wp14:editId="54ABA4C3">
+          <wp:inline distT="0" distB="0" distL="0" distR="0" wp14:anchorId="4C12A9E9" wp14:editId="030D3A6C">
             <wp:extent cx="5580000" cy="2947107"/>
             <wp:effectExtent l="0" t="0" r="0" b="0"/>
             <wp:docPr id="7" name="Picture 7"/>
@@ -4942,11 +4647,7 @@
         <w:t>Finalize</w:t>
       </w:r>
       <w:r>
-        <w:t xml:space="preserve">. Флаги дают разные </w:t>
-      </w:r>
-      <w:r>
-        <w:lastRenderedPageBreak/>
-        <w:t xml:space="preserve">наборы: </w:t>
+        <w:t xml:space="preserve">. Флаги дают разные наборы: </w:t>
       </w:r>
       <w:r>
         <w:rPr>
@@ -5009,11 +4710,12 @@
         <w:spacing w:before="360"/>
         <w:ind w:firstLine="709"/>
       </w:pPr>
-      <w:bookmarkStart w:id="9" w:name="_Toc242378593"/>
+      <w:bookmarkStart w:id="9" w:name="_Toc242385958"/>
       <w:r>
         <w:rPr>
           <w:rFonts w:ascii="Times New Roman" w:hAnsi="Times New Roman"/>
         </w:rPr>
+        <w:lastRenderedPageBreak/>
         <w:t xml:space="preserve">3.7 Задание 3. Создание экземпляра через </w:t>
       </w:r>
       <w:r>
@@ -5073,302 +4775,210 @@
     </w:p>
     <w:p>
       <w:pPr>
-        <w:spacing w:line="240" w:lineRule="auto"/>
-      </w:pPr>
-      <w:r>
-        <w:rPr>
-          <w:i/>
-          <w:sz w:val="24"/>
-        </w:rPr>
+        <w:pStyle w:val="Listing"/>
+      </w:pPr>
+      <w:r>
         <w:t>// Задание 3: создание экземпляра через Activator.CreateInstance</w:t>
       </w:r>
     </w:p>
     <w:p>
       <w:pPr>
-        <w:spacing w:line="240" w:lineRule="auto"/>
-      </w:pPr>
-      <w:r>
-        <w:rPr>
-          <w:i/>
-          <w:sz w:val="24"/>
-        </w:rPr>
+        <w:pStyle w:val="Listing"/>
+      </w:pPr>
+      <w:r>
         <w:t>public static void Task3()</w:t>
       </w:r>
     </w:p>
     <w:p>
       <w:pPr>
-        <w:spacing w:line="240" w:lineRule="auto"/>
-      </w:pPr>
-      <w:r>
-        <w:rPr>
-          <w:i/>
-          <w:sz w:val="24"/>
-        </w:rPr>
+        <w:pStyle w:val="Listing"/>
+      </w:pPr>
+      <w:r>
         <w:t>{</w:t>
       </w:r>
     </w:p>
     <w:p>
       <w:pPr>
-        <w:spacing w:line="240" w:lineRule="auto"/>
-      </w:pPr>
-      <w:r>
-        <w:rPr>
-          <w:i/>
-          <w:sz w:val="24"/>
-        </w:rPr>
+        <w:pStyle w:val="Listing"/>
+      </w:pPr>
+      <w:r>
         <w:t xml:space="preserve">    Console.WriteLine("\n=== ЗАДАНИЕ 3: Activator.CreateInstance ===\n");</w:t>
       </w:r>
     </w:p>
     <w:p>
       <w:pPr>
-        <w:spacing w:line="240" w:lineRule="auto"/>
-      </w:pPr>
-    </w:p>
-    <w:p>
-      <w:pPr>
-        <w:spacing w:line="240" w:lineRule="auto"/>
-      </w:pPr>
-      <w:r>
-        <w:rPr>
-          <w:i/>
-          <w:sz w:val="24"/>
-        </w:rPr>
+        <w:pStyle w:val="Listing"/>
+      </w:pPr>
+    </w:p>
+    <w:p>
+      <w:pPr>
+        <w:pStyle w:val="Listing"/>
+      </w:pPr>
+      <w:r>
         <w:t xml:space="preserve">    Type type = typeof(ReflectionTarget);</w:t>
       </w:r>
     </w:p>
     <w:p>
       <w:pPr>
-        <w:spacing w:line="240" w:lineRule="auto"/>
-      </w:pPr>
-    </w:p>
-    <w:p>
-      <w:pPr>
-        <w:spacing w:line="240" w:lineRule="auto"/>
-      </w:pPr>
-      <w:r>
-        <w:rPr>
-          <w:i/>
-          <w:sz w:val="24"/>
-        </w:rPr>
+        <w:pStyle w:val="Listing"/>
+      </w:pPr>
+    </w:p>
+    <w:p>
+      <w:pPr>
+        <w:pStyle w:val="Listing"/>
+      </w:pPr>
+      <w:r>
         <w:t xml:space="preserve">    // Способ 1: конструктор без параметров</w:t>
       </w:r>
     </w:p>
     <w:p>
       <w:pPr>
-        <w:spacing w:line="240" w:lineRule="auto"/>
-      </w:pPr>
-      <w:r>
-        <w:rPr>
-          <w:i/>
-          <w:sz w:val="24"/>
-        </w:rPr>
+        <w:pStyle w:val="Listing"/>
+      </w:pPr>
+      <w:r>
         <w:t xml:space="preserve">    object target1 = Activator.CreateInstance(type);</w:t>
       </w:r>
     </w:p>
     <w:p>
       <w:pPr>
-        <w:spacing w:line="240" w:lineRule="auto"/>
-      </w:pPr>
-      <w:r>
-        <w:rPr>
-          <w:i/>
-          <w:sz w:val="24"/>
-        </w:rPr>
+        <w:pStyle w:val="Listing"/>
+      </w:pPr>
+      <w:r>
         <w:t xml:space="preserve">    Console.WriteLine("Создан объект конструктором без параметров.");</w:t>
       </w:r>
     </w:p>
     <w:p>
       <w:pPr>
-        <w:spacing w:line="240" w:lineRule="auto"/>
-      </w:pPr>
-    </w:p>
-    <w:p>
-      <w:pPr>
-        <w:spacing w:line="240" w:lineRule="auto"/>
-      </w:pPr>
-      <w:r>
-        <w:rPr>
-          <w:i/>
-          <w:sz w:val="24"/>
-        </w:rPr>
+        <w:pStyle w:val="Listing"/>
+      </w:pPr>
+    </w:p>
+    <w:p>
+      <w:pPr>
+        <w:pStyle w:val="Listing"/>
+      </w:pPr>
+      <w:r>
         <w:t xml:space="preserve">    // Установка значений свойств через рефлексию</w:t>
       </w:r>
     </w:p>
     <w:p>
       <w:pPr>
-        <w:spacing w:line="240" w:lineRule="auto"/>
-      </w:pPr>
-      <w:r>
-        <w:rPr>
-          <w:i/>
-          <w:sz w:val="24"/>
-        </w:rPr>
+        <w:pStyle w:val="Listing"/>
+      </w:pPr>
+      <w:r>
         <w:t xml:space="preserve">    type.GetProperty("Age").SetValue(target1, 30);</w:t>
       </w:r>
     </w:p>
     <w:p>
       <w:pPr>
-        <w:spacing w:line="240" w:lineRule="auto"/>
-      </w:pPr>
-      <w:r>
-        <w:rPr>
-          <w:i/>
-          <w:sz w:val="24"/>
-        </w:rPr>
+        <w:pStyle w:val="Listing"/>
+      </w:pPr>
+      <w:r>
         <w:t xml:space="preserve">    type.GetProperty("Name").SetValue(target1, "Reflection object");</w:t>
       </w:r>
     </w:p>
     <w:p>
       <w:pPr>
-        <w:spacing w:line="240" w:lineRule="auto"/>
-      </w:pPr>
-      <w:r>
-        <w:rPr>
-          <w:i/>
-          <w:sz w:val="24"/>
-        </w:rPr>
+        <w:pStyle w:val="Listing"/>
+      </w:pPr>
+      <w:r>
         <w:t xml:space="preserve">    type.GetProperty("Rating").SetValue(target1, 4.0);</w:t>
       </w:r>
     </w:p>
     <w:p>
       <w:pPr>
-        <w:spacing w:line="240" w:lineRule="auto"/>
-      </w:pPr>
-    </w:p>
-    <w:p>
-      <w:pPr>
-        <w:spacing w:line="240" w:lineRule="auto"/>
-      </w:pPr>
-      <w:r>
-        <w:rPr>
-          <w:i/>
-          <w:sz w:val="24"/>
-        </w:rPr>
+        <w:pStyle w:val="Listing"/>
+      </w:pPr>
+    </w:p>
+    <w:p>
+      <w:pPr>
+        <w:pStyle w:val="Listing"/>
+      </w:pPr>
+      <w:r>
         <w:t xml:space="preserve">    // Чтение значений через рефлексию</w:t>
       </w:r>
     </w:p>
     <w:p>
       <w:pPr>
-        <w:spacing w:line="240" w:lineRule="auto"/>
-      </w:pPr>
-      <w:r>
-        <w:rPr>
-          <w:i/>
-          <w:sz w:val="24"/>
-        </w:rPr>
+        <w:pStyle w:val="Listing"/>
+      </w:pPr>
+      <w:r>
         <w:t xml:space="preserve">    Console.WriteLine($"  Age = {type.GetProperty("Age").GetValue(target1)}");</w:t>
       </w:r>
     </w:p>
     <w:p>
       <w:pPr>
-        <w:spacing w:line="240" w:lineRule="auto"/>
-      </w:pPr>
-      <w:r>
-        <w:rPr>
-          <w:i/>
-          <w:sz w:val="24"/>
-        </w:rPr>
+        <w:pStyle w:val="Listing"/>
+      </w:pPr>
+      <w:r>
         <w:t xml:space="preserve">    Console.WriteLine($"  Name = {type.GetProperty("Name").GetValue(target1)}");</w:t>
       </w:r>
     </w:p>
     <w:p>
       <w:pPr>
-        <w:spacing w:line="240" w:lineRule="auto"/>
-      </w:pPr>
-      <w:r>
-        <w:rPr>
-          <w:i/>
-          <w:sz w:val="24"/>
-        </w:rPr>
+        <w:pStyle w:val="Listing"/>
+      </w:pPr>
+      <w:r>
         <w:t xml:space="preserve">    Console.WriteLine($"  Rating = {type.GetProperty("Rating").GetValue(target1)}");</w:t>
       </w:r>
     </w:p>
     <w:p>
       <w:pPr>
-        <w:spacing w:line="240" w:lineRule="auto"/>
-      </w:pPr>
-    </w:p>
-    <w:p>
-      <w:pPr>
-        <w:spacing w:line="240" w:lineRule="auto"/>
-      </w:pPr>
-      <w:r>
-        <w:rPr>
-          <w:i/>
-          <w:sz w:val="24"/>
-        </w:rPr>
+        <w:pStyle w:val="Listing"/>
+      </w:pPr>
+    </w:p>
+    <w:p>
+      <w:pPr>
+        <w:pStyle w:val="Listing"/>
+      </w:pPr>
+      <w:r>
         <w:t xml:space="preserve">    // Способ 2: конструктор с параметрами</w:t>
       </w:r>
     </w:p>
     <w:p>
       <w:pPr>
-        <w:spacing w:line="240" w:lineRule="auto"/>
-      </w:pPr>
-      <w:r>
-        <w:rPr>
-          <w:i/>
-          <w:sz w:val="24"/>
-        </w:rPr>
+        <w:pStyle w:val="Listing"/>
+      </w:pPr>
+      <w:r>
         <w:t xml:space="preserve">    object target2 = Activator.CreateInstance(type, new object[] { 25, "With params", 3.5 });</w:t>
       </w:r>
     </w:p>
     <w:p>
       <w:pPr>
-        <w:spacing w:line="240" w:lineRule="auto"/>
-      </w:pPr>
-      <w:r>
-        <w:rPr>
-          <w:i/>
-          <w:sz w:val="24"/>
-        </w:rPr>
+        <w:pStyle w:val="Listing"/>
+      </w:pPr>
+      <w:r>
         <w:t xml:space="preserve">    Console.WriteLine("Создан объект конструктором с параметрами (25, \"With params\", 3.5).");</w:t>
       </w:r>
     </w:p>
     <w:p>
       <w:pPr>
-        <w:spacing w:line="240" w:lineRule="auto"/>
-      </w:pPr>
-      <w:r>
-        <w:rPr>
-          <w:i/>
-          <w:sz w:val="24"/>
-        </w:rPr>
+        <w:pStyle w:val="Listing"/>
+      </w:pPr>
+      <w:r>
         <w:t xml:space="preserve">    Console.WriteLine($"  Age = {type.GetProperty("Age").GetValue(target2)}");</w:t>
       </w:r>
     </w:p>
     <w:p>
       <w:pPr>
-        <w:spacing w:line="240" w:lineRule="auto"/>
-      </w:pPr>
-      <w:r>
-        <w:rPr>
-          <w:i/>
-          <w:sz w:val="24"/>
-        </w:rPr>
+        <w:pStyle w:val="Listing"/>
+      </w:pPr>
+      <w:r>
         <w:t xml:space="preserve">    Console.WriteLine($"  Name = {type.GetProperty("Name").GetValue(target2)}");</w:t>
       </w:r>
     </w:p>
     <w:p>
       <w:pPr>
-        <w:spacing w:line="240" w:lineRule="auto"/>
-      </w:pPr>
-      <w:r>
-        <w:rPr>
-          <w:i/>
-          <w:sz w:val="24"/>
-        </w:rPr>
+        <w:pStyle w:val="Listing"/>
+      </w:pPr>
+      <w:r>
         <w:t xml:space="preserve">    Console.WriteLine($"  Rating = {type.GetProperty("Rating").GetValue(target2)}");</w:t>
       </w:r>
     </w:p>
     <w:p>
       <w:pPr>
-        <w:spacing w:line="240" w:lineRule="auto"/>
-      </w:pPr>
-      <w:r>
-        <w:rPr>
-          <w:i/>
-          <w:sz w:val="24"/>
-        </w:rPr>
+        <w:pStyle w:val="Listing"/>
+      </w:pPr>
+      <w:r>
         <w:t>}</w:t>
       </w:r>
     </w:p>
@@ -5392,9 +5002,8 @@
         <w:rPr>
           <w:noProof/>
         </w:rPr>
-        <w:lastRenderedPageBreak/>
         <w:drawing>
-          <wp:inline distT="0" distB="0" distL="0" distR="0" wp14:anchorId="57DCB849" wp14:editId="4996B47E">
+          <wp:inline distT="0" distB="0" distL="0" distR="0" wp14:anchorId="2D86EE7E" wp14:editId="2C782687">
             <wp:extent cx="5580000" cy="1646913"/>
             <wp:effectExtent l="0" t="0" r="0" b="0"/>
             <wp:docPr id="8" name="Picture 8"/>
@@ -5479,7 +5088,7 @@
         <w:spacing w:before="360"/>
         <w:ind w:firstLine="709"/>
       </w:pPr>
-      <w:bookmarkStart w:id="10" w:name="_Toc242378594"/>
+      <w:bookmarkStart w:id="10" w:name="_Toc242385959"/>
       <w:r>
         <w:rPr>
           <w:rFonts w:ascii="Times New Roman" w:hAnsi="Times New Roman"/>
@@ -5593,251 +5202,168 @@
     </w:p>
     <w:p>
       <w:pPr>
-        <w:spacing w:line="240" w:lineRule="auto"/>
-      </w:pPr>
-      <w:r>
-        <w:rPr>
-          <w:i/>
-          <w:sz w:val="24"/>
-        </w:rPr>
+        <w:pStyle w:val="Listing"/>
+      </w:pPr>
+      <w:r>
         <w:t>// Задание 4: "чёрный ящик" с приватным полем и приватным методом</w:t>
       </w:r>
     </w:p>
     <w:p>
       <w:pPr>
-        <w:spacing w:line="240" w:lineRule="auto"/>
-      </w:pPr>
-      <w:r>
-        <w:rPr>
-          <w:i/>
-          <w:sz w:val="24"/>
-        </w:rPr>
+        <w:pStyle w:val="Listing"/>
+      </w:pPr>
+      <w:r>
         <w:t>public class SecretCalculator</w:t>
       </w:r>
     </w:p>
     <w:p>
       <w:pPr>
-        <w:spacing w:line="240" w:lineRule="auto"/>
-      </w:pPr>
-      <w:r>
-        <w:rPr>
-          <w:i/>
-          <w:sz w:val="24"/>
-        </w:rPr>
+        <w:pStyle w:val="Listing"/>
+      </w:pPr>
+      <w:r>
         <w:t>{</w:t>
       </w:r>
     </w:p>
     <w:p>
       <w:pPr>
-        <w:spacing w:line="240" w:lineRule="auto"/>
-      </w:pPr>
-      <w:r>
-        <w:rPr>
-          <w:i/>
-          <w:sz w:val="24"/>
-        </w:rPr>
+        <w:pStyle w:val="Listing"/>
+      </w:pPr>
+      <w:r>
         <w:t xml:space="preserve">    private int _secretValue = 10;</w:t>
       </w:r>
     </w:p>
     <w:p>
       <w:pPr>
-        <w:spacing w:line="240" w:lineRule="auto"/>
-      </w:pPr>
-    </w:p>
-    <w:p>
-      <w:pPr>
-        <w:spacing w:line="240" w:lineRule="auto"/>
-      </w:pPr>
-      <w:r>
-        <w:rPr>
-          <w:i/>
-          <w:sz w:val="24"/>
-        </w:rPr>
+        <w:pStyle w:val="Listing"/>
+      </w:pPr>
+    </w:p>
+    <w:p>
+      <w:pPr>
+        <w:pStyle w:val="Listing"/>
+      </w:pPr>
+      <w:r>
         <w:t xml:space="preserve">    // Публичный метод для чтения значения (для проверки)</w:t>
       </w:r>
     </w:p>
     <w:p>
       <w:pPr>
-        <w:spacing w:line="240" w:lineRule="auto"/>
-      </w:pPr>
-      <w:r>
-        <w:rPr>
-          <w:i/>
-          <w:sz w:val="24"/>
-        </w:rPr>
+        <w:pStyle w:val="Listing"/>
+      </w:pPr>
+      <w:r>
         <w:t xml:space="preserve">    public int ReadValue()</w:t>
       </w:r>
     </w:p>
     <w:p>
       <w:pPr>
-        <w:spacing w:line="240" w:lineRule="auto"/>
-      </w:pPr>
-      <w:r>
-        <w:rPr>
-          <w:i/>
-          <w:sz w:val="24"/>
-        </w:rPr>
+        <w:pStyle w:val="Listing"/>
+      </w:pPr>
+      <w:r>
         <w:t xml:space="preserve">    {</w:t>
       </w:r>
     </w:p>
     <w:p>
       <w:pPr>
-        <w:spacing w:line="240" w:lineRule="auto"/>
-      </w:pPr>
-      <w:r>
-        <w:rPr>
-          <w:i/>
-          <w:sz w:val="24"/>
-        </w:rPr>
+        <w:pStyle w:val="Listing"/>
+      </w:pPr>
+      <w:r>
         <w:t xml:space="preserve">        return _secretValue;</w:t>
       </w:r>
     </w:p>
     <w:p>
       <w:pPr>
-        <w:spacing w:line="240" w:lineRule="auto"/>
-      </w:pPr>
-      <w:r>
-        <w:rPr>
-          <w:i/>
-          <w:sz w:val="24"/>
-        </w:rPr>
+        <w:pStyle w:val="Listing"/>
+      </w:pPr>
+      <w:r>
         <w:t xml:space="preserve">    }</w:t>
       </w:r>
     </w:p>
     <w:p>
       <w:pPr>
-        <w:spacing w:line="240" w:lineRule="auto"/>
-      </w:pPr>
-    </w:p>
-    <w:p>
-      <w:pPr>
-        <w:spacing w:line="240" w:lineRule="auto"/>
-      </w:pPr>
-      <w:r>
-        <w:rPr>
-          <w:i/>
-          <w:sz w:val="24"/>
-        </w:rPr>
+        <w:pStyle w:val="Listing"/>
+      </w:pPr>
+    </w:p>
+    <w:p>
+      <w:pPr>
+        <w:pStyle w:val="Listing"/>
+      </w:pPr>
+      <w:r>
         <w:t xml:space="preserve">    // Приватный метод с логикой вычислений</w:t>
       </w:r>
     </w:p>
     <w:p>
       <w:pPr>
-        <w:spacing w:line="240" w:lineRule="auto"/>
-      </w:pPr>
-      <w:r>
-        <w:rPr>
-          <w:i/>
-          <w:sz w:val="24"/>
-        </w:rPr>
+        <w:pStyle w:val="Listing"/>
+      </w:pPr>
+      <w:r>
         <w:t xml:space="preserve">    private int Calculate(int a, int b)</w:t>
       </w:r>
     </w:p>
     <w:p>
       <w:pPr>
-        <w:spacing w:line="240" w:lineRule="auto"/>
-      </w:pPr>
-      <w:r>
-        <w:rPr>
-          <w:i/>
-          <w:sz w:val="24"/>
-        </w:rPr>
+        <w:pStyle w:val="Listing"/>
+      </w:pPr>
+      <w:r>
         <w:t xml:space="preserve">    {</w:t>
       </w:r>
     </w:p>
     <w:p>
       <w:pPr>
-        <w:spacing w:line="240" w:lineRule="auto"/>
-      </w:pPr>
-      <w:r>
-        <w:rPr>
-          <w:i/>
-          <w:sz w:val="24"/>
-        </w:rPr>
-        <w:t xml:space="preserve">        return a * b + _</w:t>
-      </w:r>
-      <w:r>
-        <w:rPr>
-          <w:i/>
-          <w:sz w:val="24"/>
-        </w:rPr>
-        <w:t>secretValue;</w:t>
-      </w:r>
-    </w:p>
-    <w:p>
-      <w:pPr>
-        <w:spacing w:line="240" w:lineRule="auto"/>
-      </w:pPr>
-      <w:r>
-        <w:rPr>
-          <w:i/>
-          <w:sz w:val="24"/>
-        </w:rPr>
+        <w:pStyle w:val="Listing"/>
+      </w:pPr>
+      <w:r>
+        <w:t xml:space="preserve">        return a * b + _secretValue;</w:t>
+      </w:r>
+    </w:p>
+    <w:p>
+      <w:pPr>
+        <w:pStyle w:val="Listing"/>
+      </w:pPr>
+      <w:r>
         <w:t xml:space="preserve">    }</w:t>
       </w:r>
     </w:p>
     <w:p>
       <w:pPr>
-        <w:spacing w:line="240" w:lineRule="auto"/>
-      </w:pPr>
-    </w:p>
-    <w:p>
-      <w:pPr>
-        <w:spacing w:line="240" w:lineRule="auto"/>
-      </w:pPr>
-      <w:r>
-        <w:rPr>
-          <w:i/>
-          <w:sz w:val="24"/>
-        </w:rPr>
+        <w:pStyle w:val="Listing"/>
+      </w:pPr>
+    </w:p>
+    <w:p>
+      <w:pPr>
+        <w:pStyle w:val="Listing"/>
+      </w:pPr>
+      <w:r>
         <w:t xml:space="preserve">    private void Reset()</w:t>
       </w:r>
     </w:p>
     <w:p>
       <w:pPr>
-        <w:spacing w:line="240" w:lineRule="auto"/>
-      </w:pPr>
-      <w:r>
-        <w:rPr>
-          <w:i/>
-          <w:sz w:val="24"/>
-        </w:rPr>
+        <w:pStyle w:val="Listing"/>
+      </w:pPr>
+      <w:r>
         <w:t xml:space="preserve">    {</w:t>
       </w:r>
     </w:p>
     <w:p>
       <w:pPr>
-        <w:spacing w:line="240" w:lineRule="auto"/>
-      </w:pPr>
-      <w:r>
-        <w:rPr>
-          <w:i/>
-          <w:sz w:val="24"/>
-        </w:rPr>
+        <w:pStyle w:val="Listing"/>
+      </w:pPr>
+      <w:r>
         <w:t xml:space="preserve">        _secretValue = 0;</w:t>
       </w:r>
     </w:p>
     <w:p>
       <w:pPr>
-        <w:spacing w:line="240" w:lineRule="auto"/>
-      </w:pPr>
-      <w:r>
-        <w:rPr>
-          <w:i/>
-          <w:sz w:val="24"/>
-        </w:rPr>
+        <w:pStyle w:val="Listing"/>
+      </w:pPr>
+      <w:r>
         <w:t xml:space="preserve">    }</w:t>
       </w:r>
     </w:p>
     <w:p>
       <w:pPr>
-        <w:spacing w:line="240" w:lineRule="auto"/>
-      </w:pPr>
-      <w:r>
-        <w:rPr>
-          <w:i/>
-          <w:sz w:val="24"/>
-        </w:rPr>
+        <w:pStyle w:val="Listing"/>
+      </w:pPr>
+      <w:r>
         <w:t>}</w:t>
       </w:r>
     </w:p>
@@ -5848,7 +5374,6 @@
         <w:jc w:val="both"/>
       </w:pPr>
       <w:r>
-        <w:lastRenderedPageBreak/>
         <w:t>Начальное состояние объекта показано на рисунке 3.9.</w:t>
       </w:r>
     </w:p>
@@ -5863,7 +5388,7 @@
           <w:noProof/>
         </w:rPr>
         <w:drawing>
-          <wp:inline distT="0" distB="0" distL="0" distR="0" wp14:anchorId="359715CC" wp14:editId="002C0CA7">
+          <wp:inline distT="0" distB="0" distL="0" distR="0" wp14:anchorId="186ACFDA" wp14:editId="54B4AA9F">
             <wp:extent cx="5580000" cy="866796"/>
             <wp:effectExtent l="0" t="0" r="0" b="0"/>
             <wp:docPr id="9" name="Picture 9"/>
@@ -5921,6 +5446,7 @@
         <w:jc w:val="both"/>
       </w:pPr>
       <w:r>
+        <w:lastRenderedPageBreak/>
         <w:t xml:space="preserve">Публичный метод </w:t>
       </w:r>
       <w:r>
@@ -5963,7 +5489,7 @@
         <w:spacing w:before="360"/>
         <w:ind w:firstLine="709"/>
       </w:pPr>
-      <w:bookmarkStart w:id="11" w:name="_Toc242378595"/>
+      <w:bookmarkStart w:id="11" w:name="_Toc242385960"/>
       <w:r>
         <w:rPr>
           <w:rFonts w:ascii="Times New Roman" w:hAnsi="Times New Roman"/>
@@ -6071,420 +5597,274 @@
     </w:p>
     <w:p>
       <w:pPr>
-        <w:spacing w:line="240" w:lineRule="auto"/>
-      </w:pPr>
-      <w:r>
-        <w:rPr>
-          <w:i/>
-          <w:sz w:val="24"/>
-        </w:rPr>
+        <w:pStyle w:val="Listing"/>
+      </w:pPr>
+      <w:r>
         <w:t>// Задание 5: доступ к приватному полю и его изменение</w:t>
       </w:r>
     </w:p>
     <w:p>
       <w:pPr>
-        <w:spacing w:line="240" w:lineRule="auto"/>
-      </w:pPr>
-      <w:r>
-        <w:rPr>
-          <w:i/>
-          <w:sz w:val="24"/>
-        </w:rPr>
+        <w:pStyle w:val="Listing"/>
+      </w:pPr>
+      <w:r>
         <w:t>public static void Task5()</w:t>
       </w:r>
     </w:p>
     <w:p>
       <w:pPr>
-        <w:spacing w:line="240" w:lineRule="auto"/>
-      </w:pPr>
-      <w:r>
-        <w:rPr>
-          <w:i/>
-          <w:sz w:val="24"/>
-        </w:rPr>
+        <w:pStyle w:val="Listing"/>
+      </w:pPr>
+      <w:r>
         <w:t>{</w:t>
       </w:r>
     </w:p>
     <w:p>
       <w:pPr>
-        <w:spacing w:line="240" w:lineRule="auto"/>
-      </w:pPr>
-      <w:r>
-        <w:rPr>
-          <w:i/>
-          <w:sz w:val="24"/>
-        </w:rPr>
+        <w:pStyle w:val="Listing"/>
+      </w:pPr>
+      <w:r>
         <w:t xml:space="preserve">    Console.WriteLine("\n=== ЗАДАНИЕ 5: ИЗМЕНЕНИЕ ПРИВАТНОГО ПОЛЯ ===\n");</w:t>
       </w:r>
     </w:p>
     <w:p>
       <w:pPr>
-        <w:spacing w:line="240" w:lineRule="auto"/>
-      </w:pPr>
-    </w:p>
-    <w:p>
-      <w:pPr>
-        <w:spacing w:line="240" w:lineRule="auto"/>
-      </w:pPr>
-      <w:r>
-        <w:rPr>
-          <w:i/>
-          <w:sz w:val="24"/>
-        </w:rPr>
+        <w:pStyle w:val="Listing"/>
+      </w:pPr>
+    </w:p>
+    <w:p>
+      <w:pPr>
+        <w:pStyle w:val="Listing"/>
+      </w:pPr>
+      <w:r>
         <w:t xml:space="preserve">    var calculator = new SecretCalculator();</w:t>
       </w:r>
     </w:p>
     <w:p>
       <w:pPr>
-        <w:spacing w:line="240" w:lineRule="auto"/>
-      </w:pPr>
-      <w:r>
-        <w:rPr>
-          <w:i/>
-          <w:sz w:val="24"/>
-        </w:rPr>
-        <w:t xml:space="preserve">    Type type = </w:t>
-      </w:r>
-      <w:r>
-        <w:rPr>
-          <w:i/>
-          <w:sz w:val="24"/>
-        </w:rPr>
-        <w:t>typeof(SecretCalculator);</w:t>
-      </w:r>
-    </w:p>
-    <w:p>
-      <w:pPr>
-        <w:spacing w:line="240" w:lineRule="auto"/>
-      </w:pPr>
-    </w:p>
-    <w:p>
-      <w:pPr>
-        <w:spacing w:line="240" w:lineRule="auto"/>
-      </w:pPr>
-      <w:r>
-        <w:rPr>
-          <w:i/>
-          <w:sz w:val="24"/>
-        </w:rPr>
+        <w:pStyle w:val="Listing"/>
+      </w:pPr>
+      <w:r>
+        <w:t xml:space="preserve">    Type type = typeof(SecretCalculator);</w:t>
+      </w:r>
+    </w:p>
+    <w:p>
+      <w:pPr>
+        <w:pStyle w:val="Listing"/>
+      </w:pPr>
+    </w:p>
+    <w:p>
+      <w:pPr>
+        <w:pStyle w:val="Listing"/>
+      </w:pPr>
+      <w:r>
         <w:t xml:space="preserve">    try</w:t>
       </w:r>
     </w:p>
     <w:p>
       <w:pPr>
-        <w:spacing w:line="240" w:lineRule="auto"/>
-      </w:pPr>
-      <w:r>
-        <w:rPr>
-          <w:i/>
-          <w:sz w:val="24"/>
-        </w:rPr>
+        <w:pStyle w:val="Listing"/>
+      </w:pPr>
+      <w:r>
         <w:t xml:space="preserve">    {</w:t>
       </w:r>
     </w:p>
     <w:p>
       <w:pPr>
-        <w:spacing w:line="240" w:lineRule="auto"/>
-      </w:pPr>
-      <w:r>
-        <w:rPr>
-          <w:i/>
-          <w:sz w:val="24"/>
-        </w:rPr>
+        <w:pStyle w:val="Listing"/>
+      </w:pPr>
+      <w:r>
         <w:t xml:space="preserve">        FieldInfo field = type.GetField("_secretValue",</w:t>
       </w:r>
     </w:p>
     <w:p>
       <w:pPr>
-        <w:spacing w:line="240" w:lineRule="auto"/>
-      </w:pPr>
-      <w:r>
-        <w:rPr>
-          <w:i/>
-          <w:sz w:val="24"/>
-        </w:rPr>
+        <w:pStyle w:val="Listing"/>
+      </w:pPr>
+      <w:r>
         <w:t xml:space="preserve">            BindingFlags.NonPublic | BindingFlags.Instance);</w:t>
       </w:r>
     </w:p>
     <w:p>
       <w:pPr>
-        <w:spacing w:line="240" w:lineRule="auto"/>
-      </w:pPr>
-    </w:p>
-    <w:p>
-      <w:pPr>
-        <w:spacing w:line="240" w:lineRule="auto"/>
-      </w:pPr>
-      <w:r>
-        <w:rPr>
-          <w:i/>
-          <w:sz w:val="24"/>
-        </w:rPr>
+        <w:pStyle w:val="Listing"/>
+      </w:pPr>
+    </w:p>
+    <w:p>
+      <w:pPr>
+        <w:pStyle w:val="Listing"/>
+      </w:pPr>
+      <w:r>
         <w:t xml:space="preserve">        if (field == null)</w:t>
       </w:r>
     </w:p>
     <w:p>
       <w:pPr>
-        <w:spacing w:line="240" w:lineRule="auto"/>
-      </w:pPr>
-      <w:r>
-        <w:rPr>
-          <w:i/>
-          <w:sz w:val="24"/>
-        </w:rPr>
+        <w:pStyle w:val="Listing"/>
+      </w:pPr>
+      <w:r>
         <w:t xml:space="preserve">            throw new MissingFieldException("Поле _secretValue не найдено");</w:t>
       </w:r>
     </w:p>
     <w:p>
       <w:pPr>
-        <w:spacing w:line="240" w:lineRule="auto"/>
-      </w:pPr>
-    </w:p>
-    <w:p>
-      <w:pPr>
-        <w:spacing w:line="240" w:lineRule="auto"/>
-      </w:pPr>
-      <w:r>
-        <w:rPr>
-          <w:i/>
-          <w:sz w:val="24"/>
-        </w:rPr>
+        <w:pStyle w:val="Listing"/>
+      </w:pPr>
+    </w:p>
+    <w:p>
+      <w:pPr>
+        <w:pStyle w:val="Listing"/>
+      </w:pPr>
+      <w:r>
         <w:t xml:space="preserve">        Console.WriteLine($"Значение до изменения: {field.GetValue(calculator)}");</w:t>
       </w:r>
     </w:p>
     <w:p>
       <w:pPr>
-        <w:spacing w:line="240" w:lineRule="auto"/>
-      </w:pPr>
-      <w:r>
-        <w:rPr>
-          <w:i/>
-          <w:sz w:val="24"/>
-        </w:rPr>
+        <w:pStyle w:val="Listing"/>
+      </w:pPr>
+      <w:r>
         <w:t xml:space="preserve">        field.SetValue(calculator, 25);</w:t>
       </w:r>
     </w:p>
     <w:p>
       <w:pPr>
-        <w:spacing w:line="240" w:lineRule="auto"/>
-      </w:pPr>
-      <w:r>
-        <w:rPr>
-          <w:i/>
-          <w:sz w:val="24"/>
-        </w:rPr>
+        <w:pStyle w:val="Listing"/>
+      </w:pPr>
+      <w:r>
         <w:t xml:space="preserve">        Console.WriteLine($"Значение через публичный метод ReadValue() после SetValue: {calculator.ReadValue()}");</w:t>
       </w:r>
     </w:p>
     <w:p>
       <w:pPr>
-        <w:spacing w:line="240" w:lineRule="auto"/>
-      </w:pPr>
-      <w:r>
-        <w:rPr>
-          <w:i/>
-          <w:sz w:val="24"/>
-        </w:rPr>
-        <w:t xml:space="preserve">        </w:t>
-      </w:r>
-      <w:r>
-        <w:rPr>
-          <w:i/>
-          <w:sz w:val="24"/>
-        </w:rPr>
-        <w:t>Console.WriteLine("Рефлексия нарушила инкапсуляцию: приватное поле изменено.");</w:t>
-      </w:r>
-    </w:p>
-    <w:p>
-      <w:pPr>
-        <w:spacing w:line="240" w:lineRule="auto"/>
-      </w:pPr>
-    </w:p>
-    <w:p>
-      <w:pPr>
-        <w:spacing w:line="240" w:lineRule="auto"/>
-      </w:pPr>
-      <w:r>
-        <w:rPr>
-          <w:i/>
-          <w:sz w:val="24"/>
-        </w:rPr>
+        <w:pStyle w:val="Listing"/>
+      </w:pPr>
+      <w:r>
+        <w:t xml:space="preserve">        Console.WriteLine("Рефлексия нарушила инкапсуляцию: приватное поле изменено.");</w:t>
+      </w:r>
+    </w:p>
+    <w:p>
+      <w:pPr>
+        <w:pStyle w:val="Listing"/>
+      </w:pPr>
+    </w:p>
+    <w:p>
+      <w:pPr>
+        <w:pStyle w:val="Listing"/>
+      </w:pPr>
+      <w:r>
         <w:t xml:space="preserve">        // Поле, которого нет в классе</w:t>
       </w:r>
     </w:p>
     <w:p>
       <w:pPr>
-        <w:spacing w:line="240" w:lineRule="auto"/>
-      </w:pPr>
-      <w:r>
-        <w:rPr>
-          <w:i/>
-          <w:sz w:val="24"/>
-        </w:rPr>
+        <w:pStyle w:val="Listing"/>
+      </w:pPr>
+      <w:r>
         <w:t xml:space="preserve">        FieldInfo missing = type.GetField("_unknown",</w:t>
       </w:r>
     </w:p>
     <w:p>
       <w:pPr>
-        <w:spacing w:line="240" w:lineRule="auto"/>
-      </w:pPr>
-      <w:r>
-        <w:rPr>
-          <w:i/>
-          <w:sz w:val="24"/>
-        </w:rPr>
-        <w:lastRenderedPageBreak/>
+        <w:pStyle w:val="Listing"/>
+      </w:pPr>
+      <w:r>
         <w:t xml:space="preserve">            BindingFlags.NonPublic | BindingFlags.Instance);</w:t>
       </w:r>
     </w:p>
     <w:p>
       <w:pPr>
-        <w:spacing w:line="240" w:lineRule="auto"/>
-      </w:pPr>
-      <w:r>
-        <w:rPr>
-          <w:i/>
-          <w:sz w:val="24"/>
-        </w:rPr>
+        <w:pStyle w:val="Listing"/>
+      </w:pPr>
+      <w:r>
         <w:t xml:space="preserve">        if (missing == null)</w:t>
       </w:r>
     </w:p>
     <w:p>
       <w:pPr>
-        <w:spacing w:line="240" w:lineRule="auto"/>
-      </w:pPr>
-      <w:r>
-        <w:rPr>
-          <w:i/>
-          <w:sz w:val="24"/>
-        </w:rPr>
+        <w:pStyle w:val="Listing"/>
+      </w:pPr>
+      <w:r>
         <w:t xml:space="preserve">            throw new MissingFieldException("Поле _unknown не найдено");</w:t>
       </w:r>
     </w:p>
     <w:p>
       <w:pPr>
-        <w:spacing w:line="240" w:lineRule="auto"/>
-      </w:pPr>
-      <w:r>
-        <w:rPr>
-          <w:i/>
-          <w:sz w:val="24"/>
-        </w:rPr>
+        <w:pStyle w:val="Listing"/>
+      </w:pPr>
+      <w:r>
         <w:t xml:space="preserve">    }</w:t>
       </w:r>
     </w:p>
     <w:p>
       <w:pPr>
-        <w:spacing w:line="240" w:lineRule="auto"/>
-      </w:pPr>
-      <w:r>
-        <w:rPr>
-          <w:i/>
-          <w:sz w:val="24"/>
-        </w:rPr>
+        <w:pStyle w:val="Listing"/>
+      </w:pPr>
+      <w:r>
         <w:t xml:space="preserve">    catch (MissingFieldException ex)</w:t>
       </w:r>
     </w:p>
     <w:p>
       <w:pPr>
-        <w:spacing w:line="240" w:lineRule="auto"/>
-      </w:pPr>
-      <w:r>
-        <w:rPr>
-          <w:i/>
-          <w:sz w:val="24"/>
-        </w:rPr>
+        <w:pStyle w:val="Listing"/>
+      </w:pPr>
+      <w:r>
         <w:t xml:space="preserve">    {</w:t>
       </w:r>
     </w:p>
     <w:p>
       <w:pPr>
-        <w:spacing w:line="240" w:lineRule="auto"/>
-      </w:pPr>
-      <w:r>
-        <w:rPr>
-          <w:i/>
-          <w:sz w:val="24"/>
-        </w:rPr>
+        <w:pStyle w:val="Listing"/>
+      </w:pPr>
+      <w:r>
         <w:t xml:space="preserve">        Console.WriteLine($"Ошибка: {ex.Message}");</w:t>
       </w:r>
     </w:p>
     <w:p>
       <w:pPr>
-        <w:spacing w:line="240" w:lineRule="auto"/>
-      </w:pPr>
-      <w:r>
-        <w:rPr>
-          <w:i/>
-          <w:sz w:val="24"/>
-        </w:rPr>
+        <w:pStyle w:val="Listing"/>
+      </w:pPr>
+      <w:r>
         <w:t xml:space="preserve">    }</w:t>
       </w:r>
     </w:p>
     <w:p>
       <w:pPr>
-        <w:spacing w:line="240" w:lineRule="auto"/>
-      </w:pPr>
-      <w:r>
-        <w:rPr>
-          <w:i/>
-          <w:sz w:val="24"/>
-        </w:rPr>
+        <w:pStyle w:val="Listing"/>
+      </w:pPr>
+      <w:r>
         <w:t xml:space="preserve">    catch (FieldAccessException ex)</w:t>
       </w:r>
     </w:p>
     <w:p>
       <w:pPr>
-        <w:spacing w:line="240" w:lineRule="auto"/>
-      </w:pPr>
-      <w:r>
-        <w:rPr>
-          <w:i/>
-          <w:sz w:val="24"/>
-        </w:rPr>
+        <w:pStyle w:val="Listing"/>
+      </w:pPr>
+      <w:r>
         <w:t xml:space="preserve">    {</w:t>
       </w:r>
     </w:p>
     <w:p>
       <w:pPr>
-        <w:spacing w:line="240" w:lineRule="auto"/>
-      </w:pPr>
-      <w:r>
-        <w:rPr>
-          <w:i/>
-          <w:sz w:val="24"/>
-        </w:rPr>
-        <w:t xml:space="preserve">        Console.WriteLine</w:t>
-      </w:r>
-      <w:r>
-        <w:rPr>
-          <w:i/>
-          <w:sz w:val="24"/>
-        </w:rPr>
-        <w:t>($"Недостаточно прав: {ex.Message}");</w:t>
-      </w:r>
-    </w:p>
-    <w:p>
-      <w:pPr>
-        <w:spacing w:line="240" w:lineRule="auto"/>
-      </w:pPr>
-      <w:r>
-        <w:rPr>
-          <w:i/>
-          <w:sz w:val="24"/>
-        </w:rPr>
+        <w:pStyle w:val="Listing"/>
+      </w:pPr>
+      <w:r>
+        <w:t xml:space="preserve">        Console.WriteLine($"Недостаточно прав: {ex.Message}");</w:t>
+      </w:r>
+    </w:p>
+    <w:p>
+      <w:pPr>
+        <w:pStyle w:val="Listing"/>
+      </w:pPr>
+      <w:r>
         <w:t xml:space="preserve">    }</w:t>
       </w:r>
     </w:p>
     <w:p>
       <w:pPr>
-        <w:spacing w:line="240" w:lineRule="auto"/>
-      </w:pPr>
-      <w:r>
-        <w:rPr>
-          <w:i/>
-          <w:sz w:val="24"/>
-        </w:rPr>
+        <w:pStyle w:val="Listing"/>
+      </w:pPr>
+      <w:r>
         <w:t>}</w:t>
       </w:r>
     </w:p>
@@ -6509,7 +5889,7 @@
           <w:noProof/>
         </w:rPr>
         <w:drawing>
-          <wp:inline distT="0" distB="0" distL="0" distR="0" wp14:anchorId="34EE1878" wp14:editId="2D2D771B">
+          <wp:inline distT="0" distB="0" distL="0" distR="0" wp14:anchorId="32027A18" wp14:editId="2412A683">
             <wp:extent cx="5580000" cy="1126835"/>
             <wp:effectExtent l="0" t="0" r="0" b="0"/>
             <wp:docPr id="10" name="Picture 10"/>
@@ -6582,7 +5962,7 @@
         <w:spacing w:before="360"/>
         <w:ind w:firstLine="709"/>
       </w:pPr>
-      <w:bookmarkStart w:id="12" w:name="_Toc242378596"/>
+      <w:bookmarkStart w:id="12" w:name="_Toc242385961"/>
       <w:r>
         <w:rPr>
           <w:rFonts w:ascii="Times New Roman" w:hAnsi="Times New Roman"/>
@@ -6723,305 +6103,203 @@
     </w:p>
     <w:p>
       <w:pPr>
-        <w:spacing w:line="240" w:lineRule="auto"/>
-      </w:pPr>
-      <w:r>
-        <w:rPr>
-          <w:i/>
-          <w:sz w:val="24"/>
-        </w:rPr>
+        <w:pStyle w:val="Listing"/>
+      </w:pPr>
+      <w:r>
         <w:t>// Задание 6: вызов приватного метода</w:t>
       </w:r>
     </w:p>
     <w:p>
       <w:pPr>
-        <w:spacing w:line="240" w:lineRule="auto"/>
-      </w:pPr>
-      <w:r>
-        <w:rPr>
-          <w:i/>
-          <w:sz w:val="24"/>
-        </w:rPr>
+        <w:pStyle w:val="Listing"/>
+      </w:pPr>
+      <w:r>
         <w:t>public static void Task6()</w:t>
       </w:r>
     </w:p>
     <w:p>
       <w:pPr>
-        <w:spacing w:line="240" w:lineRule="auto"/>
-      </w:pPr>
-      <w:r>
-        <w:rPr>
-          <w:i/>
-          <w:sz w:val="24"/>
-        </w:rPr>
+        <w:pStyle w:val="Listing"/>
+      </w:pPr>
+      <w:r>
         <w:t>{</w:t>
       </w:r>
     </w:p>
     <w:p>
       <w:pPr>
-        <w:spacing w:line="240" w:lineRule="auto"/>
-      </w:pPr>
-      <w:r>
-        <w:rPr>
-          <w:i/>
-          <w:sz w:val="24"/>
-        </w:rPr>
+        <w:pStyle w:val="Listing"/>
+      </w:pPr>
+      <w:r>
         <w:t xml:space="preserve">    Console.WriteLine("\n=== ЗАДАНИЕ 6: ВЫЗОВ ПРИВАТНОГО МЕТОДА ===\n");</w:t>
       </w:r>
     </w:p>
     <w:p>
       <w:pPr>
-        <w:spacing w:line="240" w:lineRule="auto"/>
-      </w:pPr>
-    </w:p>
-    <w:p>
-      <w:pPr>
-        <w:spacing w:line="240" w:lineRule="auto"/>
-      </w:pPr>
-      <w:r>
-        <w:rPr>
-          <w:i/>
-          <w:sz w:val="24"/>
-        </w:rPr>
+        <w:pStyle w:val="Listing"/>
+      </w:pPr>
+    </w:p>
+    <w:p>
+      <w:pPr>
+        <w:pStyle w:val="Listing"/>
+      </w:pPr>
+      <w:r>
         <w:t xml:space="preserve">    var calculator = new SecretCalculator();</w:t>
       </w:r>
     </w:p>
     <w:p>
       <w:pPr>
-        <w:spacing w:line="240" w:lineRule="auto"/>
-      </w:pPr>
-      <w:r>
-        <w:rPr>
-          <w:i/>
-          <w:sz w:val="24"/>
-        </w:rPr>
+        <w:pStyle w:val="Listing"/>
+      </w:pPr>
+      <w:r>
         <w:t xml:space="preserve">    Type type = typeof(SecretCalculator);</w:t>
       </w:r>
     </w:p>
     <w:p>
       <w:pPr>
-        <w:spacing w:line="240" w:lineRule="auto"/>
-      </w:pPr>
-    </w:p>
-    <w:p>
-      <w:pPr>
-        <w:spacing w:line="240" w:lineRule="auto"/>
-      </w:pPr>
-      <w:r>
-        <w:rPr>
-          <w:i/>
-          <w:sz w:val="24"/>
-        </w:rPr>
-        <w:t xml:space="preserve">    MethodInfo calculate = </w:t>
-      </w:r>
-      <w:r>
-        <w:rPr>
-          <w:i/>
-          <w:sz w:val="24"/>
-        </w:rPr>
-        <w:t>type.GetMethod("Calculate",</w:t>
-      </w:r>
-    </w:p>
-    <w:p>
-      <w:pPr>
-        <w:spacing w:line="240" w:lineRule="auto"/>
-      </w:pPr>
-      <w:r>
-        <w:rPr>
-          <w:i/>
-          <w:sz w:val="24"/>
-        </w:rPr>
+        <w:pStyle w:val="Listing"/>
+      </w:pPr>
+    </w:p>
+    <w:p>
+      <w:pPr>
+        <w:pStyle w:val="Listing"/>
+      </w:pPr>
+      <w:r>
+        <w:t xml:space="preserve">    MethodInfo calculate = type.GetMethod("Calculate",</w:t>
+      </w:r>
+    </w:p>
+    <w:p>
+      <w:pPr>
+        <w:pStyle w:val="Listing"/>
+      </w:pPr>
+      <w:r>
+        <w:t xml:space="preserve">        BindingFlags.NonPublic | BindingFlags.Instance);</w:t>
+      </w:r>
+    </w:p>
+    <w:p>
+      <w:pPr>
+        <w:pStyle w:val="Listing"/>
+      </w:pPr>
+      <w:r>
+        <w:t xml:space="preserve">    MethodInfo reset = type.GetMethod("Reset",</w:t>
+      </w:r>
+    </w:p>
+    <w:p>
+      <w:pPr>
+        <w:pStyle w:val="Listing"/>
+      </w:pPr>
+      <w:r>
+        <w:t xml:space="preserve">        BindingFlags.NonPublic | BindingFlags.Instance);</w:t>
+      </w:r>
+    </w:p>
+    <w:p>
+      <w:pPr>
+        <w:pStyle w:val="Listing"/>
+      </w:pPr>
+    </w:p>
+    <w:p>
+      <w:pPr>
+        <w:pStyle w:val="Listing"/>
+      </w:pPr>
+      <w:r>
+        <w:t xml:space="preserve">    // Способ 1: MethodInfo.Invoke, метод с двумя параметрами</w:t>
+      </w:r>
+    </w:p>
+    <w:p>
+      <w:pPr>
+        <w:pStyle w:val="Listing"/>
+      </w:pPr>
+      <w:r>
+        <w:t xml:space="preserve">    object result = calculate.Invoke(calculator, new object[] { 3, 4 });</w:t>
+      </w:r>
+    </w:p>
+    <w:p>
+      <w:pPr>
+        <w:pStyle w:val="Listing"/>
+      </w:pPr>
+      <w:r>
+        <w:t xml:space="preserve">    Console.WriteLine($"Способ 1 (Invoke) Calculate(3, 4) = {result}");</w:t>
+      </w:r>
+    </w:p>
+    <w:p>
+      <w:pPr>
+        <w:pStyle w:val="Listing"/>
+      </w:pPr>
+    </w:p>
+    <w:p>
+      <w:pPr>
+        <w:pStyle w:val="Listing"/>
+      </w:pPr>
+      <w:r>
+        <w:t xml:space="preserve">    // Способ 2: делегат</w:t>
+      </w:r>
+    </w:p>
+    <w:p>
+      <w:pPr>
+        <w:pStyle w:val="Listing"/>
+      </w:pPr>
+      <w:r>
+        <w:t xml:space="preserve">    Func&lt;int, int, int&gt; delegateMethod =</w:t>
+      </w:r>
+    </w:p>
+    <w:p>
+      <w:pPr>
+        <w:pStyle w:val="Listing"/>
+      </w:pPr>
+      <w:r>
+        <w:t xml:space="preserve">        (Func&lt;int, int, int&gt;)calculate.CreateDelegate(typeof(Func&lt;int, int, int&gt;), calculator);</w:t>
+      </w:r>
+    </w:p>
+    <w:p>
+      <w:pPr>
+        <w:pStyle w:val="Listing"/>
+      </w:pPr>
+      <w:r>
+        <w:t xml:space="preserve">    Console.WriteLine($"Способ 2 (делегат) Calculate(5, 6) = {delegateMethod(5, 6)}");</w:t>
+      </w:r>
+    </w:p>
+    <w:p>
+      <w:pPr>
+        <w:pStyle w:val="Listing"/>
+      </w:pPr>
+    </w:p>
+    <w:p>
+      <w:pPr>
+        <w:pStyle w:val="Listing"/>
+      </w:pPr>
+      <w:r>
         <w:lastRenderedPageBreak/>
-        <w:t xml:space="preserve">        BindingFlags.NonPublic | BindingFlags.Instance);</w:t>
-      </w:r>
-    </w:p>
-    <w:p>
-      <w:pPr>
-        <w:spacing w:line="240" w:lineRule="auto"/>
-      </w:pPr>
-      <w:r>
-        <w:rPr>
-          <w:i/>
-          <w:sz w:val="24"/>
-        </w:rPr>
-        <w:t xml:space="preserve">    MethodInfo reset = type.GetMethod("Reset",</w:t>
-      </w:r>
-    </w:p>
-    <w:p>
-      <w:pPr>
-        <w:spacing w:line="240" w:lineRule="auto"/>
-      </w:pPr>
-      <w:r>
-        <w:rPr>
-          <w:i/>
-          <w:sz w:val="24"/>
-        </w:rPr>
-        <w:t xml:space="preserve">        BindingFlags.NonPublic | BindingFlags.Instance);</w:t>
-      </w:r>
-    </w:p>
-    <w:p>
-      <w:pPr>
-        <w:spacing w:line="240" w:lineRule="auto"/>
-      </w:pPr>
-    </w:p>
-    <w:p>
-      <w:pPr>
-        <w:spacing w:line="240" w:lineRule="auto"/>
-      </w:pPr>
-      <w:r>
-        <w:rPr>
-          <w:i/>
-          <w:sz w:val="24"/>
-        </w:rPr>
-        <w:t xml:space="preserve">    // Способ 1: MethodInfo.Invoke, метод с двумя параметрами</w:t>
-      </w:r>
-    </w:p>
-    <w:p>
-      <w:pPr>
-        <w:spacing w:line="240" w:lineRule="auto"/>
-      </w:pPr>
-      <w:r>
-        <w:rPr>
-          <w:i/>
-          <w:sz w:val="24"/>
-        </w:rPr>
-        <w:t xml:space="preserve">    object result = calculate.Invoke(calculator, new object[] { 3, 4 });</w:t>
-      </w:r>
-    </w:p>
-    <w:p>
-      <w:pPr>
-        <w:spacing w:line="240" w:lineRule="auto"/>
-      </w:pPr>
-      <w:r>
-        <w:rPr>
-          <w:i/>
-          <w:sz w:val="24"/>
-        </w:rPr>
-        <w:t xml:space="preserve">    Console.WriteLine($"Способ 1 (Invoke) Calculate(3, 4) = {result}");</w:t>
-      </w:r>
-    </w:p>
-    <w:p>
-      <w:pPr>
-        <w:spacing w:line="240" w:lineRule="auto"/>
-      </w:pPr>
-    </w:p>
-    <w:p>
-      <w:pPr>
-        <w:spacing w:line="240" w:lineRule="auto"/>
-      </w:pPr>
-      <w:r>
-        <w:rPr>
-          <w:i/>
-          <w:sz w:val="24"/>
-        </w:rPr>
-        <w:t xml:space="preserve">    // Способ 2: делегат</w:t>
-      </w:r>
-    </w:p>
-    <w:p>
-      <w:pPr>
-        <w:spacing w:line="240" w:lineRule="auto"/>
-      </w:pPr>
-      <w:r>
-        <w:rPr>
-          <w:i/>
-          <w:sz w:val="24"/>
-        </w:rPr>
-        <w:t xml:space="preserve">    Func&lt;int, int, int&gt; delegateMethod =</w:t>
-      </w:r>
-    </w:p>
-    <w:p>
-      <w:pPr>
-        <w:spacing w:line="240" w:lineRule="auto"/>
-      </w:pPr>
-      <w:r>
-        <w:rPr>
-          <w:i/>
-          <w:sz w:val="24"/>
-        </w:rPr>
-        <w:t xml:space="preserve">        (Func&lt;int, int, int&gt;)</w:t>
-      </w:r>
-      <w:r>
-        <w:rPr>
-          <w:i/>
-          <w:sz w:val="24"/>
-        </w:rPr>
-        <w:t>calculate.CreateDelegate(typeof(Func&lt;int, int, int&gt;), calculator);</w:t>
-      </w:r>
-    </w:p>
-    <w:p>
-      <w:pPr>
-        <w:spacing w:line="240" w:lineRule="auto"/>
-      </w:pPr>
-      <w:r>
-        <w:rPr>
-          <w:i/>
-          <w:sz w:val="24"/>
-        </w:rPr>
-        <w:t xml:space="preserve">    Console.WriteLine($"Способ 2 (делегат) Calculate(5, 6) = {delegateMethod(5, 6)}");</w:t>
-      </w:r>
-    </w:p>
-    <w:p>
-      <w:pPr>
-        <w:spacing w:line="240" w:lineRule="auto"/>
-      </w:pPr>
-    </w:p>
-    <w:p>
-      <w:pPr>
-        <w:spacing w:line="240" w:lineRule="auto"/>
-      </w:pPr>
-      <w:r>
-        <w:rPr>
-          <w:i/>
-          <w:sz w:val="24"/>
-        </w:rPr>
         <w:t xml:space="preserve">    // Метод без параметров</w:t>
       </w:r>
     </w:p>
     <w:p>
       <w:pPr>
-        <w:spacing w:line="240" w:lineRule="auto"/>
-      </w:pPr>
-      <w:r>
-        <w:rPr>
-          <w:i/>
-          <w:sz w:val="24"/>
-        </w:rPr>
+        <w:pStyle w:val="Listing"/>
+      </w:pPr>
+      <w:r>
         <w:t xml:space="preserve">    Console.WriteLine($"Перед Reset(): ReadValue() = {calculator.ReadValue()}");</w:t>
       </w:r>
     </w:p>
     <w:p>
       <w:pPr>
-        <w:spacing w:line="240" w:lineRule="auto"/>
-      </w:pPr>
-      <w:r>
-        <w:rPr>
-          <w:i/>
-          <w:sz w:val="24"/>
-        </w:rPr>
+        <w:pStyle w:val="Listing"/>
+      </w:pPr>
+      <w:r>
         <w:t xml:space="preserve">    reset.Invoke(calculator, null);</w:t>
       </w:r>
     </w:p>
     <w:p>
       <w:pPr>
-        <w:spacing w:line="240" w:lineRule="auto"/>
-      </w:pPr>
-      <w:r>
-        <w:rPr>
-          <w:i/>
-          <w:sz w:val="24"/>
-        </w:rPr>
+        <w:pStyle w:val="Listing"/>
+      </w:pPr>
+      <w:r>
         <w:t xml:space="preserve">    Console.WriteLine($"После Reset() (Invoke без параметров): ReadValue() = {calculator.ReadValue()}");</w:t>
       </w:r>
     </w:p>
     <w:p>
       <w:pPr>
-        <w:spacing w:line="240" w:lineRule="auto"/>
-      </w:pPr>
-      <w:r>
-        <w:rPr>
-          <w:i/>
-          <w:sz w:val="24"/>
-        </w:rPr>
+        <w:pStyle w:val="Listing"/>
+      </w:pPr>
+      <w:r>
         <w:t>}</w:t>
       </w:r>
     </w:p>
@@ -7046,7 +6324,7 @@
           <w:noProof/>
         </w:rPr>
         <w:drawing>
-          <wp:inline distT="0" distB="0" distL="0" distR="0" wp14:anchorId="443F21EC" wp14:editId="45052FC7">
+          <wp:inline distT="0" distB="0" distL="0" distR="0" wp14:anchorId="7A8AC77A" wp14:editId="391395FF">
             <wp:extent cx="5580000" cy="1126835"/>
             <wp:effectExtent l="0" t="0" r="0" b="0"/>
             <wp:docPr id="11" name="Picture 11"/>
@@ -7164,7 +6442,7 @@
         <w:spacing w:before="360"/>
         <w:ind w:firstLine="709"/>
       </w:pPr>
-      <w:bookmarkStart w:id="13" w:name="_Toc242378597"/>
+      <w:bookmarkStart w:id="13" w:name="_Toc242385962"/>
       <w:r>
         <w:rPr>
           <w:rFonts w:ascii="Times New Roman" w:hAnsi="Times New Roman"/>
@@ -7282,233 +6560,158 @@
         <w:jc w:val="both"/>
       </w:pPr>
       <w:r>
+        <w:t>Листинг 3.7 – Интерфейс и атрибуты плагинов</w:t>
+      </w:r>
+    </w:p>
+    <w:p>
+      <w:pPr>
+        <w:pStyle w:val="Listing"/>
+      </w:pPr>
+      <w:r>
+        <w:t>[AttributeUsage(AttributeTargets.Class)]</w:t>
+      </w:r>
+    </w:p>
+    <w:p>
+      <w:pPr>
+        <w:pStyle w:val="Listing"/>
+      </w:pPr>
+      <w:r>
+        <w:t>public class PluginAttribute : Attribute</w:t>
+      </w:r>
+    </w:p>
+    <w:p>
+      <w:pPr>
+        <w:pStyle w:val="Listing"/>
+      </w:pPr>
+      <w:r>
+        <w:t>{</w:t>
+      </w:r>
+    </w:p>
+    <w:p>
+      <w:pPr>
+        <w:pStyle w:val="Listing"/>
+      </w:pPr>
+      <w:r>
+        <w:t xml:space="preserve">    public string Name { get; }</w:t>
+      </w:r>
+    </w:p>
+    <w:p>
+      <w:pPr>
+        <w:pStyle w:val="Listing"/>
+      </w:pPr>
+      <w:r>
+        <w:t xml:space="preserve">    public PluginAttribute(string name) =&gt; Name = name;</w:t>
+      </w:r>
+    </w:p>
+    <w:p>
+      <w:pPr>
+        <w:pStyle w:val="Listing"/>
+      </w:pPr>
+      <w:r>
+        <w:t>}</w:t>
+      </w:r>
+    </w:p>
+    <w:p>
+      <w:pPr>
+        <w:pStyle w:val="Listing"/>
+      </w:pPr>
+    </w:p>
+    <w:p>
+      <w:pPr>
+        <w:pStyle w:val="Listing"/>
+      </w:pPr>
+      <w:r>
+        <w:t>[AttributeUsage(AttributeTargets.Method)]</w:t>
+      </w:r>
+    </w:p>
+    <w:p>
+      <w:pPr>
+        <w:pStyle w:val="Listing"/>
+      </w:pPr>
+      <w:r>
+        <w:t>public class PluginMethodAttribute : Attribute</w:t>
+      </w:r>
+    </w:p>
+    <w:p>
+      <w:pPr>
+        <w:pStyle w:val="Listing"/>
+      </w:pPr>
+      <w:r>
+        <w:t>{</w:t>
+      </w:r>
+    </w:p>
+    <w:p>
+      <w:pPr>
+        <w:pStyle w:val="Listing"/>
+      </w:pPr>
+      <w:r>
+        <w:t xml:space="preserve">    public string Description { get; }</w:t>
+      </w:r>
+    </w:p>
+    <w:p>
+      <w:pPr>
+        <w:pStyle w:val="Listing"/>
+      </w:pPr>
+      <w:r>
+        <w:t xml:space="preserve">    public PluginMethodAttribute(string description) =&gt; Description = description;</w:t>
+      </w:r>
+    </w:p>
+    <w:p>
+      <w:pPr>
+        <w:pStyle w:val="Listing"/>
+      </w:pPr>
+      <w:r>
+        <w:t>}</w:t>
+      </w:r>
+    </w:p>
+    <w:p>
+      <w:pPr>
+        <w:pStyle w:val="Listing"/>
+      </w:pPr>
+    </w:p>
+    <w:p>
+      <w:pPr>
+        <w:pStyle w:val="Listing"/>
+      </w:pPr>
+      <w:r>
         <w:lastRenderedPageBreak/>
-        <w:t>Листинг 3.7 – Интерфейс и атрибуты плагинов</w:t>
-      </w:r>
-    </w:p>
-    <w:p>
-      <w:pPr>
-        <w:spacing w:line="240" w:lineRule="auto"/>
-      </w:pPr>
-      <w:r>
-        <w:rPr>
-          <w:i/>
-          <w:sz w:val="24"/>
-        </w:rPr>
-        <w:t>[AttributeUsage(AttributeTargets.Class)]</w:t>
-      </w:r>
-    </w:p>
-    <w:p>
-      <w:pPr>
-        <w:spacing w:line="240" w:lineRule="auto"/>
-      </w:pPr>
-      <w:r>
-        <w:rPr>
-          <w:i/>
-          <w:sz w:val="24"/>
-        </w:rPr>
-        <w:t>public class PluginAttribute : Attribute</w:t>
-      </w:r>
-    </w:p>
-    <w:p>
-      <w:pPr>
-        <w:spacing w:line="240" w:lineRule="auto"/>
-      </w:pPr>
-      <w:r>
-        <w:rPr>
-          <w:i/>
-          <w:sz w:val="24"/>
-        </w:rPr>
+        <w:t>// ============ ИНТЕРФЕЙС ============</w:t>
+      </w:r>
+    </w:p>
+    <w:p>
+      <w:pPr>
+        <w:pStyle w:val="Listing"/>
+      </w:pPr>
+    </w:p>
+    <w:p>
+      <w:pPr>
+        <w:pStyle w:val="Listing"/>
+      </w:pPr>
+      <w:r>
+        <w:t>public interface IPlugin</w:t>
+      </w:r>
+    </w:p>
+    <w:p>
+      <w:pPr>
+        <w:pStyle w:val="Listing"/>
+      </w:pPr>
+      <w:r>
         <w:t>{</w:t>
       </w:r>
     </w:p>
     <w:p>
       <w:pPr>
-        <w:spacing w:line="240" w:lineRule="auto"/>
-      </w:pPr>
-      <w:r>
-        <w:rPr>
-          <w:i/>
-          <w:sz w:val="24"/>
-        </w:rPr>
-        <w:t xml:space="preserve">    public string Name { get; }</w:t>
-      </w:r>
-    </w:p>
-    <w:p>
-      <w:pPr>
-        <w:spacing w:line="240" w:lineRule="auto"/>
-      </w:pPr>
-      <w:r>
-        <w:rPr>
-          <w:i/>
-          <w:sz w:val="24"/>
-        </w:rPr>
-        <w:t xml:space="preserve">    public PluginAttribute(string name) =&gt; Name = name;</w:t>
-      </w:r>
-    </w:p>
-    <w:p>
-      <w:pPr>
-        <w:spacing w:line="240" w:lineRule="auto"/>
-      </w:pPr>
-      <w:r>
-        <w:rPr>
-          <w:i/>
-          <w:sz w:val="24"/>
-        </w:rPr>
-        <w:t>}</w:t>
-      </w:r>
-    </w:p>
-    <w:p>
-      <w:pPr>
-        <w:spacing w:line="240" w:lineRule="auto"/>
-      </w:pPr>
-    </w:p>
-    <w:p>
-      <w:pPr>
-        <w:spacing w:line="240" w:lineRule="auto"/>
-      </w:pPr>
-      <w:r>
-        <w:rPr>
-          <w:i/>
-          <w:sz w:val="24"/>
-        </w:rPr>
-        <w:t>[AttributeUsage(AttributeTargets.Method)]</w:t>
-      </w:r>
-    </w:p>
-    <w:p>
-      <w:pPr>
-        <w:spacing w:line="240" w:lineRule="auto"/>
-      </w:pPr>
-      <w:r>
-        <w:rPr>
-          <w:i/>
-          <w:sz w:val="24"/>
-        </w:rPr>
-        <w:t>public class PluginMethodAttribute : Attribute</w:t>
-      </w:r>
-    </w:p>
-    <w:p>
-      <w:pPr>
-        <w:spacing w:line="240" w:lineRule="auto"/>
-      </w:pPr>
-      <w:r>
-        <w:rPr>
-          <w:i/>
-          <w:sz w:val="24"/>
-        </w:rPr>
-        <w:t>{</w:t>
-      </w:r>
-    </w:p>
-    <w:p>
-      <w:pPr>
-        <w:spacing w:line="240" w:lineRule="auto"/>
-      </w:pPr>
-      <w:r>
-        <w:rPr>
-          <w:i/>
-          <w:sz w:val="24"/>
-        </w:rPr>
-        <w:t xml:space="preserve">    </w:t>
-      </w:r>
-      <w:r>
-        <w:rPr>
-          <w:i/>
-          <w:sz w:val="24"/>
-        </w:rPr>
-        <w:t>public string Description { get; }</w:t>
-      </w:r>
-    </w:p>
-    <w:p>
-      <w:pPr>
-        <w:spacing w:line="240" w:lineRule="auto"/>
-      </w:pPr>
-      <w:r>
-        <w:rPr>
-          <w:i/>
-          <w:sz w:val="24"/>
-        </w:rPr>
-        <w:t xml:space="preserve">    public PluginMethodAttribute(string description) =&gt; Description = description;</w:t>
-      </w:r>
-    </w:p>
-    <w:p>
-      <w:pPr>
-        <w:spacing w:line="240" w:lineRule="auto"/>
-      </w:pPr>
-      <w:r>
-        <w:rPr>
-          <w:i/>
-          <w:sz w:val="24"/>
-        </w:rPr>
-        <w:t>}</w:t>
-      </w:r>
-    </w:p>
-    <w:p>
-      <w:pPr>
-        <w:spacing w:line="240" w:lineRule="auto"/>
-      </w:pPr>
-    </w:p>
-    <w:p>
-      <w:pPr>
-        <w:spacing w:line="240" w:lineRule="auto"/>
-      </w:pPr>
-      <w:r>
-        <w:rPr>
-          <w:i/>
-          <w:sz w:val="24"/>
-        </w:rPr>
-        <w:t>// ============ ИНТЕРФЕЙС ============</w:t>
-      </w:r>
-    </w:p>
-    <w:p>
-      <w:pPr>
-        <w:spacing w:line="240" w:lineRule="auto"/>
-      </w:pPr>
-    </w:p>
-    <w:p>
-      <w:pPr>
-        <w:spacing w:line="240" w:lineRule="auto"/>
-      </w:pPr>
-      <w:r>
-        <w:rPr>
-          <w:i/>
-          <w:sz w:val="24"/>
-        </w:rPr>
-        <w:t>public interface IPlugin</w:t>
-      </w:r>
-    </w:p>
-    <w:p>
-      <w:pPr>
-        <w:spacing w:line="240" w:lineRule="auto"/>
-      </w:pPr>
-      <w:r>
-        <w:rPr>
-          <w:i/>
-          <w:sz w:val="24"/>
-        </w:rPr>
-        <w:t>{</w:t>
-      </w:r>
-    </w:p>
-    <w:p>
-      <w:pPr>
-        <w:spacing w:line="240" w:lineRule="auto"/>
-      </w:pPr>
-      <w:r>
-        <w:rPr>
-          <w:i/>
-          <w:sz w:val="24"/>
-        </w:rPr>
+        <w:pStyle w:val="Listing"/>
+      </w:pPr>
+      <w:r>
         <w:t xml:space="preserve">    void Execute();</w:t>
       </w:r>
     </w:p>
     <w:p>
       <w:pPr>
-        <w:spacing w:line="240" w:lineRule="auto"/>
-      </w:pPr>
-      <w:r>
-        <w:rPr>
-          <w:i/>
-          <w:sz w:val="24"/>
-        </w:rPr>
+        <w:pStyle w:val="Listing"/>
+      </w:pPr>
+      <w:r>
         <w:t>}</w:t>
       </w:r>
     </w:p>
@@ -7534,478 +6737,320 @@
     </w:p>
     <w:p>
       <w:pPr>
-        <w:spacing w:line="240" w:lineRule="auto"/>
-      </w:pPr>
-      <w:r>
-        <w:rPr>
-          <w:i/>
-          <w:sz w:val="24"/>
-        </w:rPr>
+        <w:pStyle w:val="Listing"/>
+      </w:pPr>
+      <w:r>
         <w:t>public static void Load(string configPath)</w:t>
       </w:r>
     </w:p>
     <w:p>
       <w:pPr>
-        <w:spacing w:line="240" w:lineRule="auto"/>
-      </w:pPr>
-      <w:r>
-        <w:rPr>
-          <w:i/>
-          <w:sz w:val="24"/>
-        </w:rPr>
+        <w:pStyle w:val="Listing"/>
+      </w:pPr>
+      <w:r>
         <w:t>{</w:t>
       </w:r>
     </w:p>
     <w:p>
       <w:pPr>
-        <w:spacing w:line="240" w:lineRule="auto"/>
-      </w:pPr>
-      <w:r>
-        <w:rPr>
-          <w:i/>
-          <w:sz w:val="24"/>
-        </w:rPr>
+        <w:pStyle w:val="Listing"/>
+      </w:pPr>
+      <w:r>
         <w:t xml:space="preserve">    string[] names = File.ReadAllLines(configPath)</w:t>
       </w:r>
     </w:p>
     <w:p>
       <w:pPr>
-        <w:spacing w:line="240" w:lineRule="auto"/>
-      </w:pPr>
-      <w:r>
-        <w:rPr>
-          <w:i/>
-          <w:sz w:val="24"/>
-        </w:rPr>
+        <w:pStyle w:val="Listing"/>
+      </w:pPr>
+      <w:r>
         <w:t xml:space="preserve">        .Select(line =&gt; line.Trim())</w:t>
       </w:r>
     </w:p>
     <w:p>
       <w:pPr>
-        <w:spacing w:line="240" w:lineRule="auto"/>
-      </w:pPr>
-      <w:r>
-        <w:rPr>
-          <w:i/>
-          <w:sz w:val="24"/>
-        </w:rPr>
+        <w:pStyle w:val="Listing"/>
+      </w:pPr>
+      <w:r>
         <w:t xml:space="preserve">        .Where(line =&gt; line.Length &gt; 0)</w:t>
       </w:r>
     </w:p>
     <w:p>
       <w:pPr>
-        <w:spacing w:line="240" w:lineRule="auto"/>
-      </w:pPr>
-      <w:r>
-        <w:rPr>
-          <w:i/>
-          <w:sz w:val="24"/>
-        </w:rPr>
+        <w:pStyle w:val="Listing"/>
+      </w:pPr>
+      <w:r>
         <w:t xml:space="preserve">        .ToArray();</w:t>
       </w:r>
     </w:p>
     <w:p>
       <w:pPr>
-        <w:spacing w:line="240" w:lineRule="auto"/>
-      </w:pPr>
-      <w:r>
-        <w:rPr>
-          <w:i/>
-          <w:sz w:val="24"/>
-        </w:rPr>
-        <w:t xml:space="preserve">    Console.WriteLine</w:t>
-      </w:r>
-      <w:r>
-        <w:rPr>
-          <w:i/>
-          <w:sz w:val="24"/>
-        </w:rPr>
-        <w:t>($"Плагины в {Path.GetFileName(configPath)}: {string.Join(", ", names)}");</w:t>
-      </w:r>
-    </w:p>
-    <w:p>
-      <w:pPr>
-        <w:spacing w:line="240" w:lineRule="auto"/>
-      </w:pPr>
-    </w:p>
-    <w:p>
-      <w:pPr>
-        <w:spacing w:line="240" w:lineRule="auto"/>
-      </w:pPr>
-      <w:r>
-        <w:rPr>
-          <w:i/>
-          <w:sz w:val="24"/>
-        </w:rPr>
+        <w:pStyle w:val="Listing"/>
+      </w:pPr>
+      <w:r>
+        <w:t xml:space="preserve">    Console.WriteLine($"Плагины в {Path.GetFileName(configPath)}: {string.Join(", ", names)}");</w:t>
+      </w:r>
+    </w:p>
+    <w:p>
+      <w:pPr>
+        <w:pStyle w:val="Listing"/>
+      </w:pPr>
+    </w:p>
+    <w:p>
+      <w:pPr>
+        <w:pStyle w:val="Listing"/>
+      </w:pPr>
+      <w:r>
         <w:t xml:space="preserve">    // Сборка и все её типы</w:t>
       </w:r>
     </w:p>
     <w:p>
       <w:pPr>
-        <w:spacing w:line="240" w:lineRule="auto"/>
-      </w:pPr>
-      <w:r>
-        <w:rPr>
-          <w:i/>
-          <w:sz w:val="24"/>
-        </w:rPr>
+        <w:pStyle w:val="Listing"/>
+      </w:pPr>
+      <w:r>
         <w:t xml:space="preserve">    Assembly assembly = Assembly.GetExecutingAssembly();</w:t>
       </w:r>
     </w:p>
     <w:p>
       <w:pPr>
-        <w:spacing w:line="240" w:lineRule="auto"/>
-      </w:pPr>
-      <w:r>
-        <w:rPr>
-          <w:i/>
-          <w:sz w:val="24"/>
-        </w:rPr>
+        <w:pStyle w:val="Listing"/>
+      </w:pPr>
+      <w:r>
         <w:t xml:space="preserve">    Type[] types = assembly.GetTypes();</w:t>
       </w:r>
     </w:p>
     <w:p>
       <w:pPr>
-        <w:spacing w:line="240" w:lineRule="auto"/>
-      </w:pPr>
-    </w:p>
-    <w:p>
-      <w:pPr>
-        <w:spacing w:line="240" w:lineRule="auto"/>
-      </w:pPr>
-      <w:r>
-        <w:rPr>
-          <w:i/>
-          <w:sz w:val="24"/>
-        </w:rPr>
+        <w:pStyle w:val="Listing"/>
+      </w:pPr>
+    </w:p>
+    <w:p>
+      <w:pPr>
+        <w:pStyle w:val="Listing"/>
+      </w:pPr>
+      <w:r>
         <w:t xml:space="preserve">    foreach (Type type in types)</w:t>
       </w:r>
     </w:p>
     <w:p>
       <w:pPr>
-        <w:spacing w:line="240" w:lineRule="auto"/>
-      </w:pPr>
-      <w:r>
-        <w:rPr>
-          <w:i/>
-          <w:sz w:val="24"/>
-        </w:rPr>
+        <w:pStyle w:val="Listing"/>
+      </w:pPr>
+      <w:r>
         <w:t xml:space="preserve">    {</w:t>
       </w:r>
     </w:p>
     <w:p>
       <w:pPr>
-        <w:spacing w:line="240" w:lineRule="auto"/>
-      </w:pPr>
-      <w:r>
-        <w:rPr>
-          <w:i/>
-          <w:sz w:val="24"/>
-        </w:rPr>
+        <w:pStyle w:val="Listing"/>
+      </w:pPr>
+      <w:r>
         <w:t xml:space="preserve">        // Класс должен реализовывать интерфейс IPlugin</w:t>
       </w:r>
     </w:p>
     <w:p>
       <w:pPr>
-        <w:spacing w:line="240" w:lineRule="auto"/>
-      </w:pPr>
-      <w:r>
-        <w:rPr>
-          <w:i/>
-          <w:sz w:val="24"/>
-        </w:rPr>
+        <w:pStyle w:val="Listing"/>
+      </w:pPr>
+      <w:r>
         <w:t xml:space="preserve">        if (!typeof(IPlugin).IsAssignableFrom(type) || type.IsInterface || type.IsAbstract)</w:t>
       </w:r>
     </w:p>
     <w:p>
       <w:pPr>
-        <w:spacing w:line="240" w:lineRule="auto"/>
-      </w:pPr>
-      <w:r>
-        <w:rPr>
-          <w:i/>
-          <w:sz w:val="24"/>
-        </w:rPr>
+        <w:pStyle w:val="Listing"/>
+      </w:pPr>
+      <w:r>
         <w:t xml:space="preserve">            continue;</w:t>
       </w:r>
     </w:p>
     <w:p>
       <w:pPr>
-        <w:spacing w:line="240" w:lineRule="auto"/>
-      </w:pPr>
-    </w:p>
-    <w:p>
-      <w:pPr>
-        <w:spacing w:line="240" w:lineRule="auto"/>
-      </w:pPr>
-      <w:r>
-        <w:rPr>
-          <w:i/>
-          <w:sz w:val="24"/>
-        </w:rPr>
+        <w:pStyle w:val="Listing"/>
+      </w:pPr>
+    </w:p>
+    <w:p>
+      <w:pPr>
+        <w:pStyle w:val="Listing"/>
+      </w:pPr>
+      <w:r>
         <w:t xml:space="preserve">        // Атрибут PluginAttribute</w:t>
       </w:r>
     </w:p>
     <w:p>
       <w:pPr>
-        <w:spacing w:line="240" w:lineRule="auto"/>
-      </w:pPr>
-      <w:r>
-        <w:rPr>
-          <w:i/>
-          <w:sz w:val="24"/>
-        </w:rPr>
-        <w:t xml:space="preserve">        PluginAttribute attribute = type.GetCustomAttribute&lt;</w:t>
-      </w:r>
-      <w:r>
-        <w:rPr>
-          <w:i/>
-          <w:sz w:val="24"/>
-        </w:rPr>
-        <w:t>PluginAttribute&gt;();</w:t>
-      </w:r>
-    </w:p>
-    <w:p>
-      <w:pPr>
-        <w:spacing w:line="240" w:lineRule="auto"/>
-      </w:pPr>
-      <w:r>
-        <w:rPr>
-          <w:i/>
-          <w:sz w:val="24"/>
-        </w:rPr>
+        <w:pStyle w:val="Listing"/>
+      </w:pPr>
+      <w:r>
+        <w:t xml:space="preserve">        PluginAttribute attribute = type.GetCustomAttribute&lt;PluginAttribute&gt;();</w:t>
+      </w:r>
+    </w:p>
+    <w:p>
+      <w:pPr>
+        <w:pStyle w:val="Listing"/>
+      </w:pPr>
+      <w:r>
         <w:t xml:space="preserve">        if (attribute == null || !names.Contains(attribute.Name))</w:t>
       </w:r>
     </w:p>
     <w:p>
       <w:pPr>
-        <w:spacing w:line="240" w:lineRule="auto"/>
-      </w:pPr>
-      <w:r>
-        <w:rPr>
-          <w:i/>
-          <w:sz w:val="24"/>
-        </w:rPr>
+        <w:pStyle w:val="Listing"/>
+      </w:pPr>
+      <w:r>
         <w:t xml:space="preserve">            continue;</w:t>
       </w:r>
     </w:p>
     <w:p>
       <w:pPr>
-        <w:spacing w:line="240" w:lineRule="auto"/>
-      </w:pPr>
-    </w:p>
-    <w:p>
-      <w:pPr>
-        <w:spacing w:line="240" w:lineRule="auto"/>
-      </w:pPr>
-      <w:r>
-        <w:rPr>
-          <w:i/>
-          <w:sz w:val="24"/>
-        </w:rPr>
+        <w:pStyle w:val="Listing"/>
+      </w:pPr>
+    </w:p>
+    <w:p>
+      <w:pPr>
+        <w:pStyle w:val="Listing"/>
+      </w:pPr>
+      <w:r>
         <w:t xml:space="preserve">        // Создание экземпляра через Activator.CreateInstance</w:t>
       </w:r>
     </w:p>
     <w:p>
       <w:pPr>
-        <w:spacing w:line="240" w:lineRule="auto"/>
-      </w:pPr>
-      <w:r>
-        <w:rPr>
-          <w:i/>
-          <w:sz w:val="24"/>
-        </w:rPr>
+        <w:pStyle w:val="Listing"/>
+      </w:pPr>
+      <w:r>
         <w:t xml:space="preserve">        IPlugin plugin = (IPlugin)Activator.CreateInstance(type);</w:t>
       </w:r>
     </w:p>
     <w:p>
       <w:pPr>
-        <w:spacing w:line="240" w:lineRule="auto"/>
-      </w:pPr>
-      <w:r>
-        <w:rPr>
-          <w:i/>
-          <w:sz w:val="24"/>
-        </w:rPr>
+        <w:pStyle w:val="Listing"/>
+      </w:pPr>
+      <w:r>
+        <w:t xml:space="preserve">        Console.WriteLine($"\nЗагружен плагин: {attribute.Name} ({type.Name})");</w:t>
+      </w:r>
+    </w:p>
+    <w:p>
+      <w:pPr>
+        <w:pStyle w:val="Listing"/>
+      </w:pPr>
+    </w:p>
+    <w:p>
+      <w:pPr>
+        <w:pStyle w:val="Listing"/>
+      </w:pPr>
+      <w:r>
+        <w:t xml:space="preserve">        // Вызов методов плагина через рефлексию</w:t>
+      </w:r>
+    </w:p>
+    <w:p>
+      <w:pPr>
+        <w:pStyle w:val="Listing"/>
+      </w:pPr>
+      <w:r>
+        <w:t xml:space="preserve">        foreach (MethodInfo method in type.GetMethods(BindingFlags.Public | BindingFlags.Instance | BindingFlags.DeclaredOnly))</w:t>
+      </w:r>
+    </w:p>
+    <w:p>
+      <w:pPr>
+        <w:pStyle w:val="Listing"/>
+      </w:pPr>
+      <w:r>
+        <w:t xml:space="preserve">        {</w:t>
+      </w:r>
+    </w:p>
+    <w:p>
+      <w:pPr>
+        <w:pStyle w:val="Listing"/>
+      </w:pPr>
+      <w:r>
+        <w:t xml:space="preserve">            PluginMethodAttribute methodAttribute = method.GetCustomAttribute&lt;PluginMethodAttribute&gt;();</w:t>
+      </w:r>
+    </w:p>
+    <w:p>
+      <w:pPr>
+        <w:pStyle w:val="Listing"/>
+      </w:pPr>
+      <w:r>
+        <w:t xml:space="preserve">            if (methodAttribute == null)</w:t>
+      </w:r>
+    </w:p>
+    <w:p>
+      <w:pPr>
+        <w:pStyle w:val="Listing"/>
+      </w:pPr>
+      <w:r>
+        <w:t xml:space="preserve">                continue;</w:t>
+      </w:r>
+    </w:p>
+    <w:p>
+      <w:pPr>
+        <w:pStyle w:val="Listing"/>
+      </w:pPr>
+    </w:p>
+    <w:p>
+      <w:pPr>
+        <w:pStyle w:val="Listing"/>
+      </w:pPr>
+      <w:r>
+        <w:t xml:space="preserve">            Console.WriteLine($"  Метод {method.Name}: {methodAttribute.Description}");</w:t>
+      </w:r>
+    </w:p>
+    <w:p>
+      <w:pPr>
+        <w:pStyle w:val="Listing"/>
+      </w:pPr>
+      <w:r>
+        <w:t xml:space="preserve">            if (method.Name == "Add")</w:t>
+      </w:r>
+    </w:p>
+    <w:p>
+      <w:pPr>
+        <w:pStyle w:val="Listing"/>
+      </w:pPr>
+      <w:r>
+        <w:t xml:space="preserve">                Console.WriteLine($"    Результат Add(5, 3) = {method.Invoke(plugin, new object[] { 5, 3 })}");</w:t>
+      </w:r>
+    </w:p>
+    <w:p>
+      <w:pPr>
+        <w:pStyle w:val="Listing"/>
+      </w:pPr>
+      <w:r>
+        <w:t xml:space="preserve">            else</w:t>
+      </w:r>
+    </w:p>
+    <w:p>
+      <w:pPr>
+        <w:pStyle w:val="Listing"/>
+      </w:pPr>
+      <w:r>
         <w:lastRenderedPageBreak/>
-        <w:t xml:space="preserve">        Console.WriteLine($"\nЗагружен плагин: {attribute.Name} ({type.Name})");</w:t>
-      </w:r>
-    </w:p>
-    <w:p>
-      <w:pPr>
-        <w:spacing w:line="240" w:lineRule="auto"/>
-      </w:pPr>
-    </w:p>
-    <w:p>
-      <w:pPr>
-        <w:spacing w:line="240" w:lineRule="auto"/>
-      </w:pPr>
-      <w:r>
-        <w:rPr>
-          <w:i/>
-          <w:sz w:val="24"/>
-        </w:rPr>
-        <w:t xml:space="preserve">        // Вызов методов плагина через рефлексию</w:t>
-      </w:r>
-    </w:p>
-    <w:p>
-      <w:pPr>
-        <w:spacing w:line="240" w:lineRule="auto"/>
-      </w:pPr>
-      <w:r>
-        <w:rPr>
-          <w:i/>
-          <w:sz w:val="24"/>
-        </w:rPr>
-        <w:t xml:space="preserve">        foreach (MethodInfo method in type.GetMethods(BindingFlags.Public | BindingFlags.Instance | BindingFlags.DeclaredOnly))</w:t>
-      </w:r>
-    </w:p>
-    <w:p>
-      <w:pPr>
-        <w:spacing w:line="240" w:lineRule="auto"/>
-      </w:pPr>
-      <w:r>
-        <w:rPr>
-          <w:i/>
-          <w:sz w:val="24"/>
-        </w:rPr>
-        <w:t xml:space="preserve">        {</w:t>
-      </w:r>
-    </w:p>
-    <w:p>
-      <w:pPr>
-        <w:spacing w:line="240" w:lineRule="auto"/>
-      </w:pPr>
-      <w:r>
-        <w:rPr>
-          <w:i/>
-          <w:sz w:val="24"/>
-        </w:rPr>
-        <w:t xml:space="preserve">            PluginMethodAttribute methodAttribute = method.GetCustomAttribute&lt;PluginMethodAttribute&gt;();</w:t>
-      </w:r>
-    </w:p>
-    <w:p>
-      <w:pPr>
-        <w:spacing w:line="240" w:lineRule="auto"/>
-      </w:pPr>
-      <w:r>
-        <w:rPr>
-          <w:i/>
-          <w:sz w:val="24"/>
-        </w:rPr>
-        <w:t xml:space="preserve">            if (methodAttribute == null)</w:t>
-      </w:r>
-    </w:p>
-    <w:p>
-      <w:pPr>
-        <w:spacing w:line="240" w:lineRule="auto"/>
-      </w:pPr>
-      <w:r>
-        <w:rPr>
-          <w:i/>
-          <w:sz w:val="24"/>
-        </w:rPr>
-        <w:t xml:space="preserve">                continue;</w:t>
-      </w:r>
-    </w:p>
-    <w:p>
-      <w:pPr>
-        <w:spacing w:line="240" w:lineRule="auto"/>
-      </w:pPr>
-    </w:p>
-    <w:p>
-      <w:pPr>
-        <w:spacing w:line="240" w:lineRule="auto"/>
-      </w:pPr>
-      <w:r>
-        <w:rPr>
-          <w:i/>
-          <w:sz w:val="24"/>
-        </w:rPr>
-        <w:t xml:space="preserve">            Console.WriteLine($"  Метод {method.Name}: {methodAttribute.Description}");</w:t>
-      </w:r>
-    </w:p>
-    <w:p>
-      <w:pPr>
-        <w:spacing w:line="240" w:lineRule="auto"/>
-      </w:pPr>
-      <w:r>
-        <w:rPr>
-          <w:i/>
-          <w:sz w:val="24"/>
-        </w:rPr>
-        <w:t xml:space="preserve">            if (method.Name == "Add")</w:t>
-      </w:r>
-    </w:p>
-    <w:p>
-      <w:pPr>
-        <w:spacing w:line="240" w:lineRule="auto"/>
-      </w:pPr>
-      <w:r>
-        <w:rPr>
-          <w:i/>
-          <w:sz w:val="24"/>
-        </w:rPr>
-        <w:t xml:space="preserve">                Console.WriteLine($"    Результат Add(5, 3) = {method.Invoke(plugin, new object[] { 5, 3 })}");</w:t>
-      </w:r>
-    </w:p>
-    <w:p>
-      <w:pPr>
-        <w:spacing w:line="240" w:lineRule="auto"/>
-      </w:pPr>
-      <w:r>
-        <w:rPr>
-          <w:i/>
-          <w:sz w:val="24"/>
-        </w:rPr>
-        <w:t xml:space="preserve">            else</w:t>
-      </w:r>
-    </w:p>
-    <w:p>
-      <w:pPr>
-        <w:spacing w:line="240" w:lineRule="auto"/>
-      </w:pPr>
-      <w:r>
-        <w:rPr>
-          <w:i/>
-          <w:sz w:val="24"/>
-        </w:rPr>
         <w:t xml:space="preserve">                method.Invoke(plugin, null);</w:t>
       </w:r>
     </w:p>
     <w:p>
       <w:pPr>
-        <w:spacing w:line="240" w:lineRule="auto"/>
-      </w:pPr>
-      <w:r>
-        <w:rPr>
-          <w:i/>
-          <w:sz w:val="24"/>
-        </w:rPr>
+        <w:pStyle w:val="Listing"/>
+      </w:pPr>
+      <w:r>
         <w:t xml:space="preserve">        }</w:t>
       </w:r>
     </w:p>
     <w:p>
       <w:pPr>
-        <w:spacing w:line="240" w:lineRule="auto"/>
-      </w:pPr>
-      <w:r>
-        <w:rPr>
-          <w:i/>
-          <w:sz w:val="24"/>
-        </w:rPr>
+        <w:pStyle w:val="Listing"/>
+      </w:pPr>
+      <w:r>
         <w:t xml:space="preserve">    }</w:t>
       </w:r>
     </w:p>
     <w:p>
       <w:pPr>
-        <w:spacing w:line="240" w:lineRule="auto"/>
-      </w:pPr>
-      <w:r>
-        <w:rPr>
-          <w:i/>
-          <w:sz w:val="24"/>
-        </w:rPr>
+        <w:pStyle w:val="Listing"/>
+      </w:pPr>
+      <w:r>
         <w:t>}</w:t>
       </w:r>
     </w:p>
@@ -8066,7 +7111,7 @@
           <w:noProof/>
         </w:rPr>
         <w:drawing>
-          <wp:inline distT="0" distB="0" distL="0" distR="0" wp14:anchorId="7306C559" wp14:editId="65CDE24A">
+          <wp:inline distT="0" distB="0" distL="0" distR="0" wp14:anchorId="3F6E2916" wp14:editId="002AF57B">
             <wp:extent cx="5580000" cy="2557049"/>
             <wp:effectExtent l="0" t="0" r="0" b="0"/>
             <wp:docPr id="12" name="Picture 12"/>
@@ -8176,9 +7221,8 @@
         <w:rPr>
           <w:noProof/>
         </w:rPr>
-        <w:lastRenderedPageBreak/>
         <w:drawing>
-          <wp:inline distT="0" distB="0" distL="0" distR="0" wp14:anchorId="266F0D92" wp14:editId="0D6867F8">
+          <wp:inline distT="0" distB="0" distL="0" distR="0" wp14:anchorId="0B1823EA" wp14:editId="38266C46">
             <wp:extent cx="5580000" cy="2557049"/>
             <wp:effectExtent l="0" t="0" r="0" b="0"/>
             <wp:docPr id="13" name="Picture 13"/>
@@ -8261,7 +7305,7 @@
         <w:pStyle w:val="1"/>
         <w:ind w:firstLine="709"/>
       </w:pPr>
-      <w:bookmarkStart w:id="14" w:name="_Toc242378598"/>
+      <w:bookmarkStart w:id="14" w:name="_Toc242385963"/>
       <w:r>
         <w:rPr>
           <w:rFonts w:ascii="Times New Roman" w:hAnsi="Times New Roman"/>
@@ -8277,7 +7321,7 @@
         <w:spacing w:before="360"/>
         <w:ind w:firstLine="709"/>
       </w:pPr>
-      <w:bookmarkStart w:id="15" w:name="_Toc242378599"/>
+      <w:bookmarkStart w:id="15" w:name="_Toc242385964"/>
       <w:r>
         <w:rPr>
           <w:rFonts w:ascii="Times New Roman" w:hAnsi="Times New Roman"/>
@@ -8332,7 +7376,7 @@
         <w:spacing w:before="360"/>
         <w:ind w:firstLine="709"/>
       </w:pPr>
-      <w:bookmarkStart w:id="16" w:name="_Toc242378600"/>
+      <w:bookmarkStart w:id="16" w:name="_Toc242385965"/>
       <w:r>
         <w:rPr>
           <w:rFonts w:ascii="Times New Roman" w:hAnsi="Times New Roman"/>
@@ -8428,7 +7472,7 @@
         <w:spacing w:before="360"/>
         <w:ind w:firstLine="709"/>
       </w:pPr>
-      <w:bookmarkStart w:id="17" w:name="_Toc242378601"/>
+      <w:bookmarkStart w:id="17" w:name="_Toc242385966"/>
       <w:r>
         <w:rPr>
           <w:rFonts w:ascii="Times New Roman" w:hAnsi="Times New Roman"/>
@@ -8511,7 +7555,7 @@
         <w:spacing w:before="360"/>
         <w:ind w:firstLine="709"/>
       </w:pPr>
-      <w:bookmarkStart w:id="18" w:name="_Toc242378602"/>
+      <w:bookmarkStart w:id="18" w:name="_Toc242385967"/>
       <w:r>
         <w:rPr>
           <w:rFonts w:ascii="Times New Roman" w:hAnsi="Times New Roman"/>
@@ -8613,7 +7657,7 @@
         <w:spacing w:before="360"/>
         <w:ind w:firstLine="709"/>
       </w:pPr>
-      <w:bookmarkStart w:id="19" w:name="_Toc242378603"/>
+      <w:bookmarkStart w:id="19" w:name="_Toc242385968"/>
       <w:r>
         <w:rPr>
           <w:rFonts w:ascii="Times New Roman" w:hAnsi="Times New Roman"/>
@@ -8637,7 +7681,7 @@
         <w:spacing w:before="360"/>
         <w:ind w:firstLine="709"/>
       </w:pPr>
-      <w:bookmarkStart w:id="20" w:name="_Toc242378604"/>
+      <w:bookmarkStart w:id="20" w:name="_Toc242385969"/>
       <w:r>
         <w:rPr>
           <w:rFonts w:ascii="Times New Roman" w:hAnsi="Times New Roman"/>
@@ -8710,7 +7754,7 @@
         <w:spacing w:before="360"/>
         <w:ind w:firstLine="709"/>
       </w:pPr>
-      <w:bookmarkStart w:id="21" w:name="_Toc242378605"/>
+      <w:bookmarkStart w:id="21" w:name="_Toc242385970"/>
       <w:r>
         <w:rPr>
           <w:rFonts w:ascii="Times New Roman" w:hAnsi="Times New Roman"/>
@@ -8807,7 +7851,7 @@
         <w:spacing w:before="360"/>
         <w:ind w:firstLine="709"/>
       </w:pPr>
-      <w:bookmarkStart w:id="22" w:name="_Toc242378606"/>
+      <w:bookmarkStart w:id="22" w:name="_Toc242385971"/>
       <w:r>
         <w:rPr>
           <w:rFonts w:ascii="Times New Roman" w:hAnsi="Times New Roman"/>
@@ -8831,7 +7875,7 @@
         <w:spacing w:before="360"/>
         <w:ind w:firstLine="709"/>
       </w:pPr>
-      <w:bookmarkStart w:id="23" w:name="_Toc242378607"/>
+      <w:bookmarkStart w:id="23" w:name="_Toc242385972"/>
       <w:r>
         <w:rPr>
           <w:rFonts w:ascii="Times New Roman" w:hAnsi="Times New Roman"/>
@@ -8859,7 +7903,7 @@
         <w:pStyle w:val="1"/>
         <w:jc w:val="center"/>
       </w:pPr>
-      <w:bookmarkStart w:id="24" w:name="_Toc242378608"/>
+      <w:bookmarkStart w:id="24" w:name="_Toc242385973"/>
       <w:r>
         <w:rPr>
           <w:rFonts w:ascii="Times New Roman" w:hAnsi="Times New Roman"/>
@@ -9185,31 +8229,31 @@
       </w:rPr>
     </w:lvl>
   </w:abstractNum>
-  <w:num w:numId="1" w16cid:durableId="1352418043">
+  <w:num w:numId="1" w16cid:durableId="1394429673">
     <w:abstractNumId w:val="8"/>
   </w:num>
-  <w:num w:numId="2" w16cid:durableId="1139494095">
+  <w:num w:numId="2" w16cid:durableId="112754309">
     <w:abstractNumId w:val="6"/>
   </w:num>
-  <w:num w:numId="3" w16cid:durableId="1232161086">
+  <w:num w:numId="3" w16cid:durableId="953707290">
     <w:abstractNumId w:val="5"/>
   </w:num>
-  <w:num w:numId="4" w16cid:durableId="1572544674">
+  <w:num w:numId="4" w16cid:durableId="1138261647">
     <w:abstractNumId w:val="4"/>
   </w:num>
-  <w:num w:numId="5" w16cid:durableId="667513307">
+  <w:num w:numId="5" w16cid:durableId="557979193">
     <w:abstractNumId w:val="7"/>
   </w:num>
-  <w:num w:numId="6" w16cid:durableId="2030831865">
+  <w:num w:numId="6" w16cid:durableId="287127693">
     <w:abstractNumId w:val="3"/>
   </w:num>
-  <w:num w:numId="7" w16cid:durableId="508525018">
+  <w:num w:numId="7" w16cid:durableId="178351899">
     <w:abstractNumId w:val="2"/>
   </w:num>
-  <w:num w:numId="8" w16cid:durableId="1195534949">
+  <w:num w:numId="8" w16cid:durableId="1355494730">
     <w:abstractNumId w:val="1"/>
   </w:num>
-  <w:num w:numId="9" w16cid:durableId="2100059178">
+  <w:num w:numId="9" w16cid:durableId="1055928644">
     <w:abstractNumId w:val="0"/>
   </w:num>
 </w:numbering>
@@ -20597,6 +19641,17 @@
       </w:tcPr>
     </w:tblStylePr>
   </w:style>
+  <w:style w:type="paragraph" w:customStyle="1" w:styleId="Listing">
+    <w:name w:val="Listing"/>
+    <w:basedOn w:val="a1"/>
+    <w:pPr>
+      <w:spacing w:line="240" w:lineRule="auto"/>
+    </w:pPr>
+    <w:rPr>
+      <w:i/>
+      <w:sz w:val="24"/>
+    </w:rPr>
+  </w:style>
   <w:style w:type="paragraph" w:styleId="14">
     <w:name w:val="toc 1"/>
     <w:basedOn w:val="a1"/>
@@ -20604,7 +19659,7 @@
     <w:autoRedefine/>
     <w:uiPriority w:val="39"/>
     <w:unhideWhenUsed/>
-    <w:rsid w:val="00E524C8"/>
+    <w:rsid w:val="00B538CA"/>
     <w:pPr>
       <w:spacing w:after="100"/>
     </w:pPr>
@@ -20616,7 +19671,7 @@
     <w:autoRedefine/>
     <w:uiPriority w:val="39"/>
     <w:unhideWhenUsed/>
-    <w:rsid w:val="00E524C8"/>
+    <w:rsid w:val="00B538CA"/>
     <w:pPr>
       <w:spacing w:after="100"/>
       <w:ind w:left="280"/>
@@ -20627,7 +19682,7 @@
     <w:basedOn w:val="a2"/>
     <w:uiPriority w:val="99"/>
     <w:unhideWhenUsed/>
-    <w:rsid w:val="00E524C8"/>
+    <w:rsid w:val="00B538CA"/>
     <w:rPr>
       <w:color w:val="0000FF" w:themeColor="hyperlink"/>
       <w:u w:val="single"/>

</xml_diff>